<commit_message>
melhorando escolha de parâmetro + mesclando
</commit_message>
<xml_diff>
--- a/docs/Projeto_Final_ABNT_Revisado.docx
+++ b/docs/Projeto_Final_ABNT_Revisado.docx
@@ -284,31 +284,7 @@
         <w:jc w:val="both"/>
       </w:pPr>
       <w:r>
-        <w:t xml:space="preserve">Este trabalho desenvolve e compara modelos de Machine Learning Clássico para prever a gravidade de acidentes em rodovias federais de Santa Catarina. Foram usados os dados abertos da Polícia Rodoviária Federal de 2021 a 2025, com 39.849 acidentes, e a variável alvo indica se o acidente teve vítima fatal, o que ocorre em 4,2% dos casos. A análise exploratória mostrou que atropelamento e colisão frontal têm as maiores taxas de gravidade, e que trechos rurais, pista simples e período noturno também aparecem ligados a acidentes mais letais. Os dados foram separados por ano, com 2021 a 2024 para treino e 2025 para teste, e o pré-processamento foi ajustado apenas no treino para evitar vazamento de dados. Foram comparados a Regressão Logística e o KNN, otimizados com </w:t>
-      </w:r>
-      <w:proofErr w:type="spellStart"/>
-      <w:r>
-        <w:t>GridSearchCV</w:t>
-      </w:r>
-      <w:proofErr w:type="spellEnd"/>
-      <w:r>
-        <w:t xml:space="preserve"> e validação cruzada. Como as classes são desbalanceadas, a revocação e o F1 foram usados no lugar da acurácia. Foram testadas ainda duas técnicas de balanceamento do conjunto de treino, </w:t>
-      </w:r>
-      <w:proofErr w:type="spellStart"/>
-      <w:r>
-        <w:t>subamostragem</w:t>
-      </w:r>
-      <w:proofErr w:type="spellEnd"/>
-      <w:r>
-        <w:t xml:space="preserve"> aleatória e SMOTE. A Regressão Logística teve o melhor resultado, encontrando 72% dos acidentes fatais do conjunto de teste, com área sob a curva ROC de 0,853, enquanto o KNN, após o balanceamento por </w:t>
-      </w:r>
-      <w:proofErr w:type="spellStart"/>
-      <w:r>
-        <w:t>subamostragem</w:t>
-      </w:r>
-      <w:proofErr w:type="spellEnd"/>
-      <w:r>
-        <w:t>, encontrou 65%. A principal limitação é a precisão de 0,152. O modelo serve para analisar acidentes já registrados e apontar as condições ligadas à maior letalidade, o que pode orientar ações de fiscalização e de engenharia viária.</w:t>
+        <w:t xml:space="preserve">Este trabalho desenvolve e compara modelos de Machine Learning Clássico para prever a gravidade de acidentes em rodovias federais de Santa Catarina. Foram usados os dados abertos da Polícia Rodoviária Federal de 2021 a 2025, com 39.849 acidentes, e a variável alvo indica se o acidente teve vítima fatal, o que ocorre em 4,2% dos casos. A análise exploratória mostrou que atropelamento e colisão frontal têm as maiores taxas de gravidade, e que trechos rurais, pista simples e período noturno também aparecem ligados a acidentes mais letais. Os dados foram separados por ano, com 2021 a 2024 para treino e 2025 para teste, e o pré-processamento foi ajustado apenas no treino para evitar vazamento de dados. Foram comparados a Regressão Logística e o KNN, otimizados com GridSearchCV e validação cruzada. Como as classes são desbalanceadas, a revocação e o F1 foram usados no lugar da acurácia. Foram testadas ainda duas técnicas de balanceamento do conjunto de treino, subamostragem aleatória e SMOTE. A Regressão Logística teve o melhor resultado, encontrando 72% dos acidentes fatais do conjunto de teste, com área sob a curva ROC de 0,853, enquanto o KNN, após o balanceamento por subamostragem, encontrou 65%. A principal limitação é a precisão de 0,152. O modelo serve para analisar acidentes já registrados e apontar as condições ligadas à maior letalidade, o que pode orientar ações de fiscalização e de engenharia viária.</w:t>
       </w:r>
     </w:p>
     <w:p>
@@ -370,11 +346,7 @@
           </w:pPr>
           <w:r>
             <w:fldChar w:fldCharType="begin"/>
-          </w:r>
-          <w:r>
             <w:instrText xml:space="preserve"> TOC \h \u \z \t "Heading 1,1,Heading 2,2,Heading 3,3,Heading 4,4,Heading 5,5,Heading 6,6,"</w:instrText>
-          </w:r>
-          <w:r>
             <w:fldChar w:fldCharType="separate"/>
           </w:r>
           <w:hyperlink w:anchor="_heading=">
@@ -385,13 +357,6 @@
                 <w:color w:val="000000"/>
               </w:rPr>
               <w:t>1 INTRODUÇÃO, PROBLEMA E JUSTIFICATIVA</w:t>
-            </w:r>
-            <w:r>
-              <w:rPr>
-                <w:b/>
-                <w:bCs/>
-                <w:color w:val="000000"/>
-              </w:rPr>
               <w:tab/>
               <w:t>5</w:t>
             </w:r>
@@ -415,11 +380,6 @@
                 <w:color w:val="000000"/>
               </w:rPr>
               <w:t>1.1 CONTEXTUALIZAÇÃO DO PROBLEMA</w:t>
-            </w:r>
-            <w:r>
-              <w:rPr>
-                <w:color w:val="000000"/>
-              </w:rPr>
               <w:tab/>
               <w:t>5</w:t>
             </w:r>
@@ -443,11 +403,6 @@
                 <w:color w:val="000000"/>
               </w:rPr>
               <w:t>1.2 DEFINIÇÃO DO PROBLEMA DE MACHINE LEARNING</w:t>
-            </w:r>
-            <w:r>
-              <w:rPr>
-                <w:color w:val="000000"/>
-              </w:rPr>
               <w:tab/>
               <w:t>5</w:t>
             </w:r>
@@ -471,11 +426,6 @@
                 <w:color w:val="000000"/>
               </w:rPr>
               <w:t>1.3 JUSTIFICATIVA E RELEVÂNCIA</w:t>
-            </w:r>
-            <w:r>
-              <w:rPr>
-                <w:color w:val="000000"/>
-              </w:rPr>
               <w:tab/>
               <w:t>5</w:t>
             </w:r>
@@ -502,13 +452,6 @@
                 <w:color w:val="000000"/>
               </w:rPr>
               <w:t>2 OBJETIVOS</w:t>
-            </w:r>
-            <w:r>
-              <w:rPr>
-                <w:b/>
-                <w:bCs/>
-                <w:color w:val="000000"/>
-              </w:rPr>
               <w:tab/>
               <w:t>6</w:t>
             </w:r>
@@ -532,11 +475,6 @@
                 <w:color w:val="000000"/>
               </w:rPr>
               <w:t>2.1 OBJETIVO GERAL</w:t>
-            </w:r>
-            <w:r>
-              <w:rPr>
-                <w:color w:val="000000"/>
-              </w:rPr>
               <w:tab/>
               <w:t>6</w:t>
             </w:r>
@@ -560,11 +498,6 @@
                 <w:color w:val="000000"/>
               </w:rPr>
               <w:t>2.2 OBJETIVOS ESPECÍFICOS</w:t>
-            </w:r>
-            <w:r>
-              <w:rPr>
-                <w:color w:val="000000"/>
-              </w:rPr>
               <w:tab/>
               <w:t>6</w:t>
             </w:r>
@@ -591,13 +524,6 @@
                 <w:color w:val="000000"/>
               </w:rPr>
               <w:t>3 FUNDAMENTAÇÃO TEÓRICA</w:t>
-            </w:r>
-            <w:r>
-              <w:rPr>
-                <w:b/>
-                <w:bCs/>
-                <w:color w:val="000000"/>
-              </w:rPr>
               <w:tab/>
               <w:t>6</w:t>
             </w:r>
@@ -621,11 +547,6 @@
                 <w:color w:val="000000"/>
               </w:rPr>
               <w:t>3.1 TEORIA DO PROBLEMA</w:t>
-            </w:r>
-            <w:r>
-              <w:rPr>
-                <w:color w:val="000000"/>
-              </w:rPr>
               <w:tab/>
               <w:t>7</w:t>
             </w:r>
@@ -649,11 +570,6 @@
                 <w:color w:val="000000"/>
               </w:rPr>
               <w:t>3.1.1 Conceitos do domínio</w:t>
-            </w:r>
-            <w:r>
-              <w:rPr>
-                <w:color w:val="000000"/>
-              </w:rPr>
               <w:tab/>
               <w:t>7</w:t>
             </w:r>
@@ -677,11 +593,6 @@
                 <w:color w:val="000000"/>
               </w:rPr>
               <w:t>3.1.2 Estatísticas e fatos</w:t>
-            </w:r>
-            <w:r>
-              <w:rPr>
-                <w:color w:val="000000"/>
-              </w:rPr>
               <w:tab/>
               <w:t>7</w:t>
             </w:r>
@@ -705,11 +616,6 @@
                 <w:color w:val="000000"/>
               </w:rPr>
               <w:t>3.1.3 Soluções sem Machine Learning e suas limitações</w:t>
-            </w:r>
-            <w:r>
-              <w:rPr>
-                <w:color w:val="000000"/>
-              </w:rPr>
               <w:tab/>
               <w:t>7</w:t>
             </w:r>
@@ -733,11 +639,6 @@
                 <w:color w:val="000000"/>
               </w:rPr>
               <w:t>3.2 REFERENCIAL TEÓRICO EM MACHINE LEARNING</w:t>
-            </w:r>
-            <w:r>
-              <w:rPr>
-                <w:color w:val="000000"/>
-              </w:rPr>
               <w:tab/>
               <w:t>8</w:t>
             </w:r>
@@ -761,11 +662,6 @@
                 <w:color w:val="000000"/>
               </w:rPr>
               <w:t>3.2.1 Modelo A: Regressão Logística</w:t>
-            </w:r>
-            <w:r>
-              <w:rPr>
-                <w:color w:val="000000"/>
-              </w:rPr>
               <w:tab/>
               <w:t>8</w:t>
             </w:r>
@@ -789,11 +685,6 @@
                 <w:color w:val="000000"/>
               </w:rPr>
               <w:t>3.2.2 Modelo B: K-Nearest Neighbors</w:t>
-            </w:r>
-            <w:r>
-              <w:rPr>
-                <w:color w:val="000000"/>
-              </w:rPr>
               <w:tab/>
               <w:t>8</w:t>
             </w:r>
@@ -817,11 +708,6 @@
                 <w:color w:val="000000"/>
               </w:rPr>
               <w:t>3.3 TRABALHOS RELACIONADOS</w:t>
-            </w:r>
-            <w:r>
-              <w:rPr>
-                <w:color w:val="000000"/>
-              </w:rPr>
               <w:tab/>
               <w:t>9</w:t>
             </w:r>
@@ -848,13 +734,6 @@
                 <w:color w:val="000000"/>
               </w:rPr>
               <w:t>4 METODOLOGIA E DESENVOLVIMENTO</w:t>
-            </w:r>
-            <w:r>
-              <w:rPr>
-                <w:b/>
-                <w:bCs/>
-                <w:color w:val="000000"/>
-              </w:rPr>
               <w:tab/>
               <w:t>10</w:t>
             </w:r>
@@ -878,11 +757,6 @@
                 <w:color w:val="000000"/>
               </w:rPr>
               <w:t>4.1 ANÁLISE EXPLORATÓRIA DE DADOS</w:t>
-            </w:r>
-            <w:r>
-              <w:rPr>
-                <w:color w:val="000000"/>
-              </w:rPr>
               <w:tab/>
               <w:t>10</w:t>
             </w:r>
@@ -906,11 +780,6 @@
                 <w:color w:val="000000"/>
               </w:rPr>
               <w:t>4.1.1 Descrição dos dados</w:t>
-            </w:r>
-            <w:r>
-              <w:rPr>
-                <w:color w:val="000000"/>
-              </w:rPr>
               <w:tab/>
               <w:t>10</w:t>
             </w:r>
@@ -934,11 +803,6 @@
                 <w:color w:val="000000"/>
               </w:rPr>
               <w:t>4.1.2 Diagnóstico</w:t>
-            </w:r>
-            <w:r>
-              <w:rPr>
-                <w:color w:val="000000"/>
-              </w:rPr>
               <w:tab/>
               <w:t>11</w:t>
             </w:r>
@@ -962,11 +826,6 @@
                 <w:color w:val="000000"/>
               </w:rPr>
               <w:t>4.1.3 Visualizações e achados</w:t>
-            </w:r>
-            <w:r>
-              <w:rPr>
-                <w:color w:val="000000"/>
-              </w:rPr>
               <w:tab/>
               <w:t>12</w:t>
             </w:r>
@@ -990,11 +849,6 @@
                 <w:color w:val="000000"/>
               </w:rPr>
               <w:t>4.2 PRÉ-PROCESSAMENTO E ENGENHARIA DE ATRIBUTOS</w:t>
-            </w:r>
-            <w:r>
-              <w:rPr>
-                <w:color w:val="000000"/>
-              </w:rPr>
               <w:tab/>
               <w:t>14</w:t>
             </w:r>
@@ -1018,11 +872,6 @@
                 <w:color w:val="000000"/>
               </w:rPr>
               <w:t>4.2.1 Divisão dos dados</w:t>
-            </w:r>
-            <w:r>
-              <w:rPr>
-                <w:color w:val="000000"/>
-              </w:rPr>
               <w:tab/>
               <w:t>14</w:t>
             </w:r>
@@ -1046,11 +895,6 @@
                 <w:color w:val="000000"/>
               </w:rPr>
               <w:t>4.2.2 Tratamento de valores ausentes</w:t>
-            </w:r>
-            <w:r>
-              <w:rPr>
-                <w:color w:val="000000"/>
-              </w:rPr>
               <w:tab/>
               <w:t>14</w:t>
             </w:r>
@@ -1074,11 +918,6 @@
                 <w:color w:val="000000"/>
               </w:rPr>
               <w:t>4.2.3 Codificação categórica</w:t>
-            </w:r>
-            <w:r>
-              <w:rPr>
-                <w:color w:val="000000"/>
-              </w:rPr>
               <w:tab/>
               <w:t>15</w:t>
             </w:r>
@@ -1102,11 +941,6 @@
                 <w:color w:val="000000"/>
               </w:rPr>
               <w:t>4.2.4 Escalonamento</w:t>
-            </w:r>
-            <w:r>
-              <w:rPr>
-                <w:color w:val="000000"/>
-              </w:rPr>
               <w:tab/>
               <w:t>15</w:t>
             </w:r>
@@ -1130,11 +964,6 @@
                 <w:color w:val="000000"/>
               </w:rPr>
               <w:t>4.2.5 Engenharia de atributos</w:t>
-            </w:r>
-            <w:r>
-              <w:rPr>
-                <w:color w:val="000000"/>
-              </w:rPr>
               <w:tab/>
               <w:t>16</w:t>
             </w:r>
@@ -1158,11 +987,6 @@
                 <w:color w:val="000000"/>
               </w:rPr>
               <w:t>4.2.6 Tratamento do desbalanceamento</w:t>
-            </w:r>
-            <w:r>
-              <w:rPr>
-                <w:color w:val="000000"/>
-              </w:rPr>
               <w:tab/>
               <w:t>16</w:t>
             </w:r>
@@ -1186,11 +1010,6 @@
                 <w:color w:val="000000"/>
               </w:rPr>
               <w:t>4.3 IMPLEMENTAÇÃO E OTIMIZAÇÃO</w:t>
-            </w:r>
-            <w:r>
-              <w:rPr>
-                <w:color w:val="000000"/>
-              </w:rPr>
               <w:tab/>
               <w:t>17</w:t>
             </w:r>
@@ -1214,11 +1033,6 @@
                 <w:color w:val="000000"/>
               </w:rPr>
               <w:t>4.4 AVALIAÇÃO E RESULTADOS</w:t>
-            </w:r>
-            <w:r>
-              <w:rPr>
-                <w:color w:val="000000"/>
-              </w:rPr>
               <w:tab/>
               <w:t>18</w:t>
             </w:r>
@@ -1242,11 +1056,6 @@
                 <w:color w:val="000000"/>
               </w:rPr>
               <w:t>4.4.1 Escolha das métricas</w:t>
-            </w:r>
-            <w:r>
-              <w:rPr>
-                <w:color w:val="000000"/>
-              </w:rPr>
               <w:tab/>
               <w:t>18</w:t>
             </w:r>
@@ -1270,11 +1079,6 @@
                 <w:color w:val="000000"/>
               </w:rPr>
               <w:t>4.4.2 Comparação dos modelos</w:t>
-            </w:r>
-            <w:r>
-              <w:rPr>
-                <w:color w:val="000000"/>
-              </w:rPr>
               <w:tab/>
               <w:t>18</w:t>
             </w:r>
@@ -1298,11 +1102,6 @@
                 <w:color w:val="000000"/>
               </w:rPr>
               <w:t>4.4.3 Sobreajuste</w:t>
-            </w:r>
-            <w:r>
-              <w:rPr>
-                <w:color w:val="000000"/>
-              </w:rPr>
               <w:tab/>
               <w:t>21</w:t>
             </w:r>
@@ -1326,11 +1125,6 @@
                 <w:color w:val="000000"/>
               </w:rPr>
               <w:t>4.4.4 Ajuste do limiar de decisão</w:t>
-            </w:r>
-            <w:r>
-              <w:rPr>
-                <w:color w:val="000000"/>
-              </w:rPr>
               <w:tab/>
               <w:t>21</w:t>
             </w:r>
@@ -1354,11 +1148,6 @@
                 <w:color w:val="000000"/>
               </w:rPr>
               <w:t>4.4.5 Contribuição dos atributos</w:t>
-            </w:r>
-            <w:r>
-              <w:rPr>
-                <w:color w:val="000000"/>
-              </w:rPr>
               <w:tab/>
               <w:t>22</w:t>
             </w:r>
@@ -1382,11 +1171,6 @@
                 <w:color w:val="000000"/>
               </w:rPr>
               <w:t>4.4.6 Análise crítica e escolha do modelo</w:t>
-            </w:r>
-            <w:r>
-              <w:rPr>
-                <w:color w:val="000000"/>
-              </w:rPr>
               <w:tab/>
               <w:t>23</w:t>
             </w:r>
@@ -1413,13 +1197,6 @@
                 <w:color w:val="000000"/>
               </w:rPr>
               <w:t>5 CONCLUSÃO, PRODUTO FINAL E CRONOGRAMA</w:t>
-            </w:r>
-            <w:r>
-              <w:rPr>
-                <w:b/>
-                <w:bCs/>
-                <w:color w:val="000000"/>
-              </w:rPr>
               <w:tab/>
               <w:t>24</w:t>
             </w:r>
@@ -1443,11 +1220,6 @@
                 <w:color w:val="000000"/>
               </w:rPr>
               <w:t>5.1 CONCLUSÃO</w:t>
-            </w:r>
-            <w:r>
-              <w:rPr>
-                <w:color w:val="000000"/>
-              </w:rPr>
               <w:tab/>
               <w:t>24</w:t>
             </w:r>
@@ -1471,11 +1243,6 @@
                 <w:color w:val="000000"/>
               </w:rPr>
               <w:t>5.2 LIMITAÇÕES</w:t>
-            </w:r>
-            <w:r>
-              <w:rPr>
-                <w:color w:val="000000"/>
-              </w:rPr>
               <w:tab/>
               <w:t>24</w:t>
             </w:r>
@@ -1496,11 +1263,6 @@
                 <w:color w:val="000000"/>
               </w:rPr>
               <w:t>5.3 PRODUTO FINAL</w:t>
-            </w:r>
-            <w:r>
-              <w:rPr>
-                <w:color w:val="000000"/>
-              </w:rPr>
               <w:tab/>
               <w:t>25</w:t>
             </w:r>
@@ -1523,29 +1285,17 @@
               <w:rPr>
                 <w:color w:val="000000"/>
               </w:rPr>
-              <w:t>5.3.1</w:t>
+              <w:t xml:space="preserve">5.3.1 </w:t>
+            </w:r>
+            <w:r>
+              <w:t>Aplicação web para visualização dos resultados</w:t>
             </w:r>
             <w:r>
               <w:rPr>
                 <w:color w:val="000000"/>
               </w:rPr>
-              <w:t xml:space="preserve"> </w:t>
-            </w:r>
-            <w:r>
-              <w:t>Aplicação web para visualização dos resultados</w:t>
-            </w:r>
-            <w:r>
-              <w:rPr>
-                <w:color w:val="000000"/>
-              </w:rPr>
               <w:tab/>
-              <w:t>2</w:t>
-            </w:r>
-            <w:r>
-              <w:rPr>
-                <w:color w:val="000000"/>
-              </w:rPr>
-              <w:t>6</w:t>
+              <w:t>26</w:t>
             </w:r>
           </w:hyperlink>
         </w:p>
@@ -1567,19 +1317,12 @@
                 <w:color w:val="000000"/>
               </w:rPr>
               <w:t>5.4 CRONOGRAMA</w:t>
-            </w:r>
-            <w:r>
-              <w:rPr>
-                <w:color w:val="000000"/>
-              </w:rPr>
               <w:tab/>
               <w:t>2</w:t>
             </w:r>
           </w:hyperlink>
           <w:r>
             <w:fldChar w:fldCharType="end"/>
-          </w:r>
-          <w:r>
             <w:t>7</w:t>
           </w:r>
         </w:p>
@@ -1655,15 +1398,7 @@
         <w:jc w:val="both"/>
       </w:pPr>
       <w:r>
-        <w:t xml:space="preserve">O problema é de classificação binária. A variável alvo se chama grave e vale 1 quando o acidente teve vítima fatal, 0 nos outros casos. Ela vem da coluna </w:t>
-      </w:r>
-      <w:proofErr w:type="spellStart"/>
-      <w:r>
-        <w:t>classificacao_acidente</w:t>
-      </w:r>
-      <w:proofErr w:type="spellEnd"/>
-      <w:r>
-        <w:t xml:space="preserve"> do arquivo original.</w:t>
+        <w:t xml:space="preserve">O problema é de classificação binária. A variável alvo se chama grave e vale 1 quando o acidente teve vítima fatal, 0 nos outros casos. Ela vem da coluna classificacao_acidente do arquivo original.</w:t>
       </w:r>
     </w:p>
     <w:p>
@@ -2398,21 +2133,8 @@
         <w:spacing w:before="240" w:after="160" w:line="360" w:lineRule="auto"/>
       </w:pPr>
       <w:r>
-        <w:t>3.2.2 Modelo B: K-</w:t>
-      </w:r>
-      <w:proofErr w:type="spellStart"/>
-      <w:r>
-        <w:t>Nearest</w:t>
-      </w:r>
-      <w:proofErr w:type="spellEnd"/>
-      <w:r>
-        <w:t xml:space="preserve"> </w:t>
-      </w:r>
-      <w:proofErr w:type="spellStart"/>
-      <w:r>
-        <w:t>Neighbors</w:t>
-      </w:r>
-      <w:proofErr w:type="spellEnd"/>
+        <w:t xml:space="preserve">3.2.2 Modelo B: K-Nearest Neighbors</w:t>
+      </w:r>
     </w:p>
     <w:p>
       <w:pPr>
@@ -2461,10 +2183,7 @@
       </w:pPr>
       <w:r>
         <w:lastRenderedPageBreak/>
-        <w:t>Outros estudos já aplicaram aprendizado de máquina à gravidade de acidentes, alguns com os mesmos dados abertos da PRF. Eles não foram reproduzidos aqui: serviram para mostrar quais caminhos a literatura usa no tratamento do desbalanceamento, e cada técnica encontrada foi testada nos nossos dados.</w:t>
-      </w:r>
-      <w:r>
-        <w:t xml:space="preserve"> Ademais, alguns dos estudos nem sequer referem-se à área de machine learning, focando em maneiras dinâmicas e intuitivas de apresentar os dados, bem como partindo para análises sociais quanto à origem de determinados sinistros.</w:t>
+        <w:t xml:space="preserve">Outros estudos já aplicaram aprendizado de máquina à gravidade de acidentes, alguns com os mesmos dados abertos da PRF. Eles não foram reproduzidos aqui: serviram para mostrar quais caminhos a literatura usa no tratamento do desbalanceamento, e cada técnica encontrada foi testada nos nossos dados. Ademais, alguns dos estudos nem sequer referem-se à área de machine learning, focando em maneiras dinâmicas e intuitivas de apresentar os dados, bem como partindo para análises sociais quanto à origem de determinados sinistros.</w:t>
       </w:r>
     </w:p>
     <w:p>
@@ -2474,46 +2193,7 @@
         <w:jc w:val="both"/>
       </w:pPr>
       <w:r>
-        <w:t>Mattos et al. (2019) desenvolveram uma aplicação para visualização dos dados abertos da Polícia Rodoviária Federal utilizando registros de acidentes ocorridos entre 2007 e 2018</w:t>
-      </w:r>
-      <w:r>
-        <w:t xml:space="preserve"> com o objetivo de </w:t>
-      </w:r>
-      <w:r>
-        <w:t xml:space="preserve">permitir a exploração visual dos acidentes e a identificação de </w:t>
-      </w:r>
-      <w:r>
-        <w:t>padrões de risco</w:t>
-      </w:r>
-      <w:r>
-        <w:t xml:space="preserve">. O trabalho utilizou informações geográficas e temporais </w:t>
-      </w:r>
-      <w:r>
-        <w:t>para formular uma</w:t>
-      </w:r>
-      <w:r>
-        <w:t xml:space="preserve"> abordagem </w:t>
-      </w:r>
-      <w:r>
-        <w:t>capaz</w:t>
-      </w:r>
-      <w:r>
-        <w:t xml:space="preserve"> de transformar uma grande quantidade de registros em informações visuais mais facilmente interpretáveis. </w:t>
-      </w:r>
-      <w:r>
-        <w:t>P</w:t>
-      </w:r>
-      <w:r>
-        <w:t xml:space="preserve">or possuir caráter predominantemente descritivo e exploratório, </w:t>
-      </w:r>
-      <w:r>
-        <w:t xml:space="preserve">entretanto, </w:t>
-      </w:r>
-      <w:r>
-        <w:t>a solução não produz um classificador capaz de estimar a gravidade de uma nova ocorrência</w:t>
-      </w:r>
-      <w:r>
-        <w:t>, mas serve como base para uma maneira intuitiva e dinâmica de exibir dados tratados.</w:t>
+        <w:t xml:space="preserve">Mattos et al. (2019) desenvolveram uma aplicação para visualização dos dados abertos da Polícia Rodoviária Federal utilizando registros de acidentes ocorridos entre 2007 e 2018 com o objetivo de permitir a exploração visual dos acidentes e a identificação de padrões de risco. O trabalho utilizou informações geográficas e temporais para formular uma abordagem capaz de transformar uma grande quantidade de registros em informações visuais mais facilmente interpretáveis. Por possuir caráter predominantemente descritivo e exploratório, entretanto, a solução não produz um classificador capaz de estimar a gravidade de uma nova ocorrência, mas serve como base para uma maneira intuitiva e dinâmica de exibir dados tratados.</w:t>
       </w:r>
     </w:p>
     <w:p>
@@ -2522,37 +2202,8 @@
         <w:ind w:firstLine="709"/>
         <w:jc w:val="both"/>
       </w:pPr>
-      <w:proofErr w:type="spellStart"/>
-      <w:r>
-        <w:t>Mafort</w:t>
-      </w:r>
-      <w:proofErr w:type="spellEnd"/>
-      <w:r>
-        <w:t xml:space="preserve"> e </w:t>
-      </w:r>
-      <w:proofErr w:type="spellStart"/>
-      <w:r>
-        <w:t>Kappel</w:t>
-      </w:r>
-      <w:proofErr w:type="spellEnd"/>
-      <w:r>
-        <w:t xml:space="preserve"> (2025) analisaram as rodovias federais do Rio de Janeiro entre 2020 e 2023, também com a base por ocorrência. Compararam sete algoritmos com otimização de </w:t>
-      </w:r>
-      <w:proofErr w:type="spellStart"/>
-      <w:r>
-        <w:t>hiperparâmetros</w:t>
-      </w:r>
-      <w:proofErr w:type="spellEnd"/>
-      <w:r>
-        <w:t xml:space="preserve"> e validação cruzada, e trataram o desbalanceamento com </w:t>
-      </w:r>
-      <w:proofErr w:type="spellStart"/>
-      <w:r>
-        <w:t>subamostragem</w:t>
-      </w:r>
-      <w:proofErr w:type="spellEnd"/>
-      <w:r>
-        <w:t xml:space="preserve"> aleatória, aplicada apenas ao treino de cada divisão. A Regressão Logística foi o modelo mais estável, com 73,85% de acurácia e área sob a curva ROC de 0,698. O melhor KNN usou dezoito vizinhos e distância de Manhattan. Para identificar os fatores de risco, aplicaram a ferramenta LIME, que apontou o tipo de acidente como o preditor mais influente, seguido da fase do dia, das condições meteorológicas, da localização e da densidade de acidentes por quilômetro.</w:t>
+      <w:r>
+        <w:t xml:space="preserve">Mafort e Kappel (2025) analisaram as rodovias federais do Rio de Janeiro entre 2020 e 2023, também com a base por ocorrência. Compararam sete algoritmos com otimização de hiperparâmetros e validação cruzada, e trataram o desbalanceamento com subamostragem aleatória, aplicada apenas ao treino de cada divisão. A Regressão Logística foi o modelo mais estável, com 73,85% de acurácia e área sob a curva ROC de 0,698. O melhor KNN usou dezoito vizinhos e distância de Manhattan. Para identificar os fatores de risco, aplicaram a ferramenta LIME, que apontou o tipo de acidente como o preditor mais influente, seguido da fase do dia, das condições meteorológicas, da localização e da densidade de acidentes por quilômetro.</w:t>
       </w:r>
     </w:p>
     <w:p>
@@ -2583,23 +2234,7 @@
         <w:jc w:val="both"/>
       </w:pPr>
       <w:r>
-        <w:t xml:space="preserve">Fiorentini e </w:t>
-      </w:r>
-      <w:proofErr w:type="spellStart"/>
-      <w:r>
-        <w:t>Losa</w:t>
-      </w:r>
-      <w:proofErr w:type="spellEnd"/>
-      <w:r>
-        <w:t xml:space="preserve"> (2020) compararam árvore de decisão, KNN, Random Forest e Regressão Logística com e sem balanceamento por </w:t>
-      </w:r>
-      <w:proofErr w:type="spellStart"/>
-      <w:r>
-        <w:t>subamostragem</w:t>
-      </w:r>
-      <w:proofErr w:type="spellEnd"/>
-      <w:r>
-        <w:t>, e defendem avaliar o desempenho classe por classe em vez de usar a acurácia global.</w:t>
+        <w:t xml:space="preserve">Fiorentini e Losa (2020) compararam árvore de decisão, KNN, Random Forest e Regressão Logística com e sem balanceamento por subamostragem, e defendem avaliar o desempenho classe por classe em vez de usar a acurácia global.</w:t>
       </w:r>
     </w:p>
     <w:p>
@@ -2609,78 +2244,7 @@
         <w:jc w:val="both"/>
       </w:pPr>
       <w:r>
-        <w:t xml:space="preserve">Em escala nacional, </w:t>
-      </w:r>
-      <w:r>
-        <w:t xml:space="preserve">Malaquias et al. (2021) </w:t>
-      </w:r>
-      <w:r>
-        <w:t>avaliaram diferentes</w:t>
-      </w:r>
-      <w:r>
-        <w:t xml:space="preserve"> abordage</w:t>
-      </w:r>
-      <w:r>
-        <w:t>ns</w:t>
-      </w:r>
-      <w:r>
-        <w:t xml:space="preserve"> para classificar as causas de acidentes ocorridos em rodovias</w:t>
-      </w:r>
-      <w:r>
-        <w:t xml:space="preserve"> brasileiras. </w:t>
-      </w:r>
-      <w:r>
-        <w:t xml:space="preserve">Foram </w:t>
-      </w:r>
-      <w:r>
-        <w:t>considerados</w:t>
-      </w:r>
-      <w:r>
-        <w:t xml:space="preserve"> os algoritmos Floresta Aleatória, </w:t>
-      </w:r>
-      <w:proofErr w:type="spellStart"/>
-      <w:r>
-        <w:t>Naive</w:t>
-      </w:r>
-      <w:proofErr w:type="spellEnd"/>
-      <w:r>
-        <w:t xml:space="preserve"> </w:t>
-      </w:r>
-      <w:proofErr w:type="spellStart"/>
-      <w:r>
-        <w:t>Bayes</w:t>
-      </w:r>
-      <w:proofErr w:type="spellEnd"/>
-      <w:r>
-        <w:t xml:space="preserve">, Regressão Logística e Máquina de Vetores de Suporte, utilizando diferentes etapas de </w:t>
-      </w:r>
-      <w:r>
-        <w:t>pré-processamento</w:t>
-      </w:r>
-      <w:r>
-        <w:t xml:space="preserve">, como transformação de variáveis e balanceamento por </w:t>
-      </w:r>
-      <w:proofErr w:type="spellStart"/>
-      <w:r>
-        <w:t>subamostragem</w:t>
-      </w:r>
-      <w:proofErr w:type="spellEnd"/>
-      <w:r>
-        <w:t>.</w:t>
-      </w:r>
-      <w:r>
-        <w:t xml:space="preserve"> </w:t>
-      </w:r>
-      <w:r>
-        <w:t xml:space="preserve">O melhor resultado foi obtido pela Floresta Aleatória após o balanceamento, com acurácia de aproximadamente 69%, além de </w:t>
-      </w:r>
-      <w:proofErr w:type="gramStart"/>
-      <w:r>
-        <w:t>melhores</w:t>
-      </w:r>
-      <w:proofErr w:type="gramEnd"/>
-      <w:r>
-        <w:t xml:space="preserve"> resultados para as classes minoritárias em comparação com os modelos anteriores.</w:t>
+        <w:t xml:space="preserve">Em escala nacional, Malaquias et al. (2021) avaliaram diferentes abordagens para classificar as causas de acidentes ocorridos em rodovias brasileiras. Foram considerados os algoritmos Floresta Aleatória, Naive Bayes, Regressão Logística e Máquina de Vetores de Suporte, utilizando diferentes etapas de pré-processamento, como transformação de variáveis e balanceamento por subamostragem. O melhor resultado foi obtido pela Floresta Aleatória após o balanceamento, com acurácia de aproximadamente 69%, além de melhores resultados para as classes minoritárias em comparação com os modelos anteriores.</w:t>
       </w:r>
     </w:p>
     <w:p>
@@ -2690,13 +2254,7 @@
         <w:jc w:val="both"/>
       </w:pPr>
       <w:r>
-        <w:t>A Tabela 2 resume as diferenças</w:t>
-      </w:r>
-      <w:r>
-        <w:t xml:space="preserve"> de projetos externos</w:t>
-      </w:r>
-      <w:r>
-        <w:t xml:space="preserve"> em relação a este trabalho.</w:t>
+        <w:t xml:space="preserve">A Tabela 2 resume as diferenças de projetos externos em relação a este trabalho.</w:t>
       </w:r>
     </w:p>
     <w:p>
@@ -2858,37 +2416,12 @@
             </w:tcMar>
           </w:tcPr>
           <w:p>
-            <w:proofErr w:type="spellStart"/>
-            <w:r>
-              <w:rPr>
-                <w:sz w:val="20"/>
-                <w:szCs w:val="20"/>
-              </w:rPr>
-              <w:t>Mafort</w:t>
-            </w:r>
-            <w:proofErr w:type="spellEnd"/>
-            <w:r>
-              <w:rPr>
-                <w:sz w:val="20"/>
-                <w:szCs w:val="20"/>
-              </w:rPr>
-              <w:t xml:space="preserve"> e </w:t>
-            </w:r>
-            <w:proofErr w:type="spellStart"/>
-            <w:r>
-              <w:rPr>
-                <w:sz w:val="20"/>
-                <w:szCs w:val="20"/>
-              </w:rPr>
-              <w:t>Kappel</w:t>
-            </w:r>
-            <w:proofErr w:type="spellEnd"/>
-            <w:r>
-              <w:rPr>
-                <w:sz w:val="20"/>
-                <w:szCs w:val="20"/>
-              </w:rPr>
-              <w:t xml:space="preserve"> (2025)</w:t>
+            <w:r>
+              <w:rPr>
+                <w:sz w:val="20"/>
+                <w:szCs w:val="20"/>
+              </w:rPr>
+              <w:t xml:space="preserve">Mafort e Kappel (2025)</w:t>
             </w:r>
           </w:p>
         </w:tc>
@@ -2929,21 +2462,12 @@
             <w:pPr>
               <w:jc w:val="center"/>
             </w:pPr>
-            <w:proofErr w:type="spellStart"/>
-            <w:r>
-              <w:rPr>
-                <w:sz w:val="20"/>
-                <w:szCs w:val="20"/>
-              </w:rPr>
-              <w:t>Subamostragem</w:t>
-            </w:r>
-            <w:proofErr w:type="spellEnd"/>
-            <w:r>
-              <w:rPr>
-                <w:sz w:val="20"/>
-                <w:szCs w:val="20"/>
-              </w:rPr>
-              <w:t xml:space="preserve"> aleatória</w:t>
+            <w:r>
+              <w:rPr>
+                <w:sz w:val="20"/>
+                <w:szCs w:val="20"/>
+              </w:rPr>
+              <w:t xml:space="preserve">Subamostragem aleatória</w:t>
             </w:r>
           </w:p>
         </w:tc>
@@ -3179,23 +2703,7 @@
                 <w:sz w:val="20"/>
                 <w:szCs w:val="20"/>
               </w:rPr>
-              <w:t xml:space="preserve">Fiorentini e </w:t>
-            </w:r>
-            <w:proofErr w:type="spellStart"/>
-            <w:r>
-              <w:rPr>
-                <w:sz w:val="20"/>
-                <w:szCs w:val="20"/>
-              </w:rPr>
-              <w:t>Losa</w:t>
-            </w:r>
-            <w:proofErr w:type="spellEnd"/>
-            <w:r>
-              <w:rPr>
-                <w:sz w:val="20"/>
-                <w:szCs w:val="20"/>
-              </w:rPr>
-              <w:t xml:space="preserve"> (2020)</w:t>
+              <w:t xml:space="preserve">Fiorentini e Losa (2020)</w:t>
             </w:r>
           </w:p>
         </w:tc>
@@ -3236,21 +2744,12 @@
             <w:pPr>
               <w:jc w:val="center"/>
             </w:pPr>
-            <w:proofErr w:type="spellStart"/>
-            <w:r>
-              <w:rPr>
-                <w:sz w:val="20"/>
-                <w:szCs w:val="20"/>
-              </w:rPr>
-              <w:t>Subamostragem</w:t>
-            </w:r>
-            <w:proofErr w:type="spellEnd"/>
-            <w:r>
-              <w:rPr>
-                <w:sz w:val="20"/>
-                <w:szCs w:val="20"/>
-              </w:rPr>
-              <w:t xml:space="preserve"> aleatória</w:t>
+            <w:r>
+              <w:rPr>
+                <w:sz w:val="20"/>
+                <w:szCs w:val="20"/>
+              </w:rPr>
+              <w:t xml:space="preserve">Subamostragem aleatória</w:t>
             </w:r>
           </w:p>
         </w:tc>
@@ -3357,7 +2856,6 @@
                 <w:szCs w:val="20"/>
               </w:rPr>
             </w:pPr>
-            <w:proofErr w:type="spellStart"/>
             <w:r>
               <w:rPr>
                 <w:sz w:val="20"/>
@@ -3365,7 +2863,6 @@
               </w:rPr>
               <w:t>Subamostragem</w:t>
             </w:r>
-            <w:proofErr w:type="spellEnd"/>
           </w:p>
         </w:tc>
         <w:tc>
@@ -3510,29 +3007,9 @@
         <w:jc w:val="both"/>
       </w:pPr>
       <w:r>
-        <w:t xml:space="preserve">A diferença metodológica mais relevante é a divisão. Os </w:t>
-      </w:r>
-      <w:r>
-        <w:t>cinco</w:t>
-      </w:r>
-      <w:r>
-        <w:t xml:space="preserve"> trabalhos separam treino e teste por sorteio, enquanto aqui o teste é um ano inteiro que o modelo nunca viu, o que se aproxima mais do uso real e produz métricas mais </w:t>
-      </w:r>
-      <w:r>
+        <w:t xml:space="preserve">A diferença metodológica mais relevante é a divisão. Os cinco trabalhos separam treino e teste por sorteio, enquanto aqui o teste é um ano inteiro que o modelo nunca viu, o que se aproxima mais do uso real e produz métricas mais </w:t>
         <w:lastRenderedPageBreak/>
-        <w:t>conservadoras.</w:t>
-      </w:r>
-      <w:r>
-        <w:t xml:space="preserve"> </w:t>
-      </w:r>
-      <w:r>
-        <w:t>Além disso,</w:t>
-      </w:r>
-      <w:r>
-        <w:t xml:space="preserve"> vale ressaltar que</w:t>
-      </w:r>
-      <w:r>
-        <w:t xml:space="preserve"> o trabalho de Malaquias et al. (2021) possui objetivo distinto, voltado à classificação das causas dos acidentes, mas apresenta abordagem relevante quanto ao tratamento do desbalanceamento e à comparação de diferentes algoritmos.</w:t>
+        <w:t xml:space="preserve">conservadoras. Além disso, vale ressaltar que o trabalho de Malaquias et al. (2021) possui objetivo distinto, voltado à classificação das causas dos acidentes, mas apresenta abordagem relevante quanto ao tratamento do desbalanceamento e à comparação de diferentes algoritmos.</w:t>
       </w:r>
     </w:p>
     <w:p>
@@ -3542,61 +3019,7 @@
         <w:jc w:val="both"/>
       </w:pPr>
       <w:r>
-        <w:t>Portanto, apesar das diferenças listadas, a</w:t>
-      </w:r>
-      <w:r>
-        <w:t xml:space="preserve"> abordagem de </w:t>
-      </w:r>
-      <w:proofErr w:type="spellStart"/>
-      <w:r>
-        <w:t>Mafort</w:t>
-      </w:r>
-      <w:proofErr w:type="spellEnd"/>
-      <w:r>
-        <w:t xml:space="preserve"> e </w:t>
-      </w:r>
-      <w:proofErr w:type="spellStart"/>
-      <w:r>
-        <w:t>Kappel</w:t>
-      </w:r>
-      <w:proofErr w:type="spellEnd"/>
-      <w:r>
-        <w:t xml:space="preserve"> (2025) </w:t>
-      </w:r>
-      <w:r>
-        <w:t>pode ser classificada como a mais</w:t>
-      </w:r>
-      <w:r>
-        <w:t xml:space="preserve"> próxima metodologicamente deste trabalho, </w:t>
-      </w:r>
-      <w:r>
-        <w:t>já que</w:t>
-      </w:r>
-      <w:r>
-        <w:t xml:space="preserve"> utiliza a mesma fonte de dados</w:t>
-      </w:r>
-      <w:r>
-        <w:t xml:space="preserve"> </w:t>
-      </w:r>
-      <w:r>
-        <w:t xml:space="preserve">e possui como objetivo a classificação da gravidade. Os autores também empregaram Regressão Logística e KNN, dois dos algoritmos utilizados aqui, além de realizarem pré-processamento, balanceamento, otimização de </w:t>
-      </w:r>
-      <w:proofErr w:type="spellStart"/>
-      <w:r>
-        <w:t>hiperparâmetros</w:t>
-      </w:r>
-      <w:proofErr w:type="spellEnd"/>
-      <w:r>
-        <w:t xml:space="preserve"> e validação cruzada. Essa </w:t>
-      </w:r>
-      <w:r>
-        <w:t>semelhança</w:t>
-      </w:r>
-      <w:r>
-        <w:t xml:space="preserve"> permite uma comparação metodológica mais direta</w:t>
-      </w:r>
-      <w:r>
-        <w:t xml:space="preserve"> e aproxima este trabalho do estado da arte.</w:t>
+        <w:t xml:space="preserve">Portanto, apesar das diferenças listadas, a abordagem de Mafort e Kappel (2025) pode ser classificada como a mais próxima metodologicamente deste trabalho, já que utiliza a mesma fonte de dados e possui como objetivo a classificação da gravidade. Os autores também empregaram Regressão Logística e KNN, dois dos algoritmos utilizados aqui, além de realizarem pré-processamento, balanceamento, otimização de hiperparâmetros e validação cruzada. Essa semelhança permite uma comparação metodológica mais direta e aproxima este trabalho do estado da arte.</w:t>
       </w:r>
     </w:p>
     <w:p>
@@ -3606,22 +3029,7 @@
         <w:jc w:val="both"/>
       </w:pPr>
       <w:r>
-        <w:t>Dessa forma, os trabalhos relacionados indicam que o uso de Machine Learning na análise de acidentes rodoviários apresenta potencial tanto para identificar padrões quanto para classificar causas e gravidade</w:t>
-      </w:r>
-      <w:r>
-        <w:t xml:space="preserve">, além de </w:t>
-      </w:r>
-      <w:r>
-        <w:t>evidencia</w:t>
-      </w:r>
-      <w:r>
-        <w:t>rem</w:t>
-      </w:r>
-      <w:r>
-        <w:t xml:space="preserve"> que o tratamento do desbalanceamento, a seleção das variáveis, o pré-processamento e a estratégia de divisão dos dados possuem influência significativa nos resultados</w:t>
-      </w:r>
-      <w:r>
-        <w:t>, demonstrando a importância desses processos.</w:t>
+        <w:t xml:space="preserve">Dessa forma, os trabalhos relacionados indicam que o uso de Machine Learning na análise de acidentes rodoviários apresenta potencial tanto para identificar padrões quanto para classificar causas e gravidade, além de evidenciarem que o tratamento do desbalanceamento, a seleção das variáveis, o pré-processamento e a estratégia de divisão dos dados possuem influência significativa nos resultados, demonstrando a importância desses processos.</w:t>
       </w:r>
     </w:p>
     <w:p>
@@ -3679,8 +3087,6 @@
       </w:pPr>
       <w:r>
         <w:t xml:space="preserve">O arquivo de 2021 a 2025 tem 342.624 registros do país inteiro. Depois do filtro por estado sobraram 39.849 acidentes de Santa Catarina, em 31 colunas: 20 vieram como texto e 11 como número. Três das colunas de texto, km, latitude e longitude, são numéricas na verdade e vieram como texto por causa da vírgula decimal. As </w:t>
-      </w:r>
-      <w:r>
         <w:lastRenderedPageBreak/>
         <w:t>colunas descrevem o momento do acidente, a posição na rodovia, as condições em que ele ocorreu e o resultado em vítimas e veículos.</w:t>
       </w:r>
@@ -3711,15 +3117,7 @@
         <w:jc w:val="both"/>
       </w:pPr>
       <w:r>
-        <w:t xml:space="preserve">Achamos três códigos que representam ausência sem usar valor nulo: o rótulo Ignorado no clima, com 341 casos, o rótulo Não Informado no sentido da via, com 44, e o valor zero na coluna </w:t>
-      </w:r>
-      <w:proofErr w:type="spellStart"/>
-      <w:r>
-        <w:t>br</w:t>
-      </w:r>
-      <w:proofErr w:type="spellEnd"/>
-      <w:r>
-        <w:t>, também com 44. Testamos e os dois últimos são exatamente as mesmas linhas, ou seja, um grupo de registros preenchidos pela metade.</w:t>
+        <w:t xml:space="preserve">Achamos três códigos que representam ausência sem usar valor nulo: o rótulo Ignorado no clima, com 341 casos, o rótulo Não Informado no sentido da via, com 44, e o valor zero na coluna br, também com 44. Testamos e os dois últimos são exatamente as mesmas linhas, ou seja, um grupo de registros preenchidos pela metade.</w:t>
       </w:r>
     </w:p>
     <w:p>
@@ -4152,7 +3550,6 @@
             </w:tcMar>
           </w:tcPr>
           <w:p>
-            <w:proofErr w:type="spellStart"/>
             <w:r>
               <w:rPr>
                 <w:sz w:val="20"/>
@@ -4160,7 +3557,6 @@
               </w:rPr>
               <w:t>veiculos</w:t>
             </w:r>
-            <w:proofErr w:type="spellEnd"/>
           </w:p>
         </w:tc>
         <w:tc>
@@ -4271,7 +3667,6 @@
             </w:tcMar>
           </w:tcPr>
           <w:p>
-            <w:proofErr w:type="spellStart"/>
             <w:r>
               <w:rPr>
                 <w:sz w:val="20"/>
@@ -4279,7 +3674,6 @@
               </w:rPr>
               <w:t>ocupacao</w:t>
             </w:r>
-            <w:proofErr w:type="spellEnd"/>
           </w:p>
         </w:tc>
         <w:tc>
@@ -5322,15 +4716,7 @@
         <w:jc w:val="both"/>
       </w:pPr>
       <w:r>
-        <w:t xml:space="preserve">Pensamos em preencher a coluna </w:t>
-      </w:r>
-      <w:proofErr w:type="spellStart"/>
-      <w:r>
-        <w:t>br</w:t>
-      </w:r>
-      <w:proofErr w:type="spellEnd"/>
-      <w:r>
-        <w:t xml:space="preserve"> pela moda, que é o que o material da disciplina indica para variáveis categóricas. Deixamos de lado porque a moda é a BR-101, a rodovia central da nossa análise, e preencher pela moda aumenta a categoria que já é maioria.</w:t>
+        <w:t xml:space="preserve">Pensamos em preencher a coluna br pela moda, que é o que o material da disciplina indica para variáveis categóricas. Deixamos de lado porque a moda é a BR-101, a rodovia central da nossa análise, e preencher pela moda aumenta a categoria que já é maioria.</w:t>
       </w:r>
     </w:p>
     <w:p>
@@ -5349,23 +4735,7 @@
         <w:jc w:val="both"/>
       </w:pPr>
       <w:r>
-        <w:t xml:space="preserve">Todas as variáveis categóricas receberam </w:t>
-      </w:r>
-      <w:proofErr w:type="spellStart"/>
-      <w:r>
-        <w:t>One</w:t>
-      </w:r>
-      <w:proofErr w:type="spellEnd"/>
-      <w:r>
-        <w:t xml:space="preserve">-Hot </w:t>
-      </w:r>
-      <w:proofErr w:type="spellStart"/>
-      <w:r>
-        <w:t>Encoding</w:t>
-      </w:r>
-      <w:proofErr w:type="spellEnd"/>
-      <w:r>
-        <w:t>, e nenhuma recebeu codificação ordinal. O tipo de pista parece admitir ordem pelo número de faixas, mas a taxa de gravidade é 5,15% em pista simples, 4,36% em múltipla e 2,49% em dupla, sequência que não é crescente nem decrescente. A fase do dia e o dia da semana são cíclicos, então uma escala numérica também não serviria.</w:t>
+        <w:t xml:space="preserve">Todas as variáveis categóricas receberam One-Hot Encoding, e nenhuma recebeu codificação ordinal. O tipo de pista parece admitir ordem pelo número de faixas, mas a taxa de gravidade é 5,15% em pista simples, 4,36% em múltipla e 2,49% em dupla, sequência que não é crescente nem decrescente. A fase do dia e o dia da semana são cíclicos, então uma escala numérica também não serviria.</w:t>
       </w:r>
     </w:p>
     <w:p>
@@ -5385,15 +4755,7 @@
         <w:jc w:val="both"/>
       </w:pPr>
       <w:r>
-        <w:t xml:space="preserve">O codificador usa o parâmetro </w:t>
-      </w:r>
-      <w:proofErr w:type="spellStart"/>
-      <w:r>
-        <w:t>handle_unknown</w:t>
-      </w:r>
-      <w:proofErr w:type="spellEnd"/>
-      <w:r>
-        <w:t xml:space="preserve"> como ignore. Ele é necessário porque a divisão temporal permite que o teste tenha alguma categoria que não apareceu no treino.</w:t>
+        <w:t xml:space="preserve">O codificador usa o parâmetro handle_unknown como ignore. Ele é necessário porque a divisão temporal permite que o teste tenha alguma categoria que não apareceu no treino.</w:t>
       </w:r>
     </w:p>
     <w:p>
@@ -5413,31 +4775,7 @@
       </w:pPr>
       <w:r>
         <w:lastRenderedPageBreak/>
-        <w:t xml:space="preserve">Usamos o </w:t>
-      </w:r>
-      <w:proofErr w:type="spellStart"/>
-      <w:r>
-        <w:t>RobustScaler</w:t>
-      </w:r>
-      <w:proofErr w:type="spellEnd"/>
-      <w:r>
-        <w:t xml:space="preserve">, que centraliza pela mediana e divide pelo intervalo interquartil, em vez do </w:t>
-      </w:r>
-      <w:proofErr w:type="spellStart"/>
-      <w:r>
-        <w:t>StandardScaler</w:t>
-      </w:r>
-      <w:proofErr w:type="spellEnd"/>
-      <w:r>
-        <w:t xml:space="preserve"> ou do </w:t>
-      </w:r>
-      <w:proofErr w:type="spellStart"/>
-      <w:r>
-        <w:t>MinMaxScaler</w:t>
-      </w:r>
-      <w:proofErr w:type="spellEnd"/>
-      <w:r>
-        <w:t>.</w:t>
+        <w:t xml:space="preserve">Usamos o RobustScaler, que centraliza pela mediana e divide pelo intervalo interquartil, em vez do StandardScaler ou do MinMaxScaler.</w:t>
       </w:r>
     </w:p>
     <w:p>
@@ -5457,15 +4795,7 @@
         <w:jc w:val="both"/>
       </w:pPr>
       <w:r>
-        <w:t xml:space="preserve">Com esses valores mantidos, o </w:t>
-      </w:r>
-      <w:proofErr w:type="spellStart"/>
-      <w:r>
-        <w:t>StandardScaler</w:t>
-      </w:r>
-      <w:proofErr w:type="spellEnd"/>
-      <w:r>
-        <w:t xml:space="preserve"> não serviria, porque média e desvio padrão são puxados pelos extremos. A mediana e o intervalo interquartil não sofrem essa influência.</w:t>
+        <w:t xml:space="preserve">Com esses valores mantidos, o StandardScaler não serviria, porque média e desvio padrão são puxados pelos extremos. A mediana e o intervalo interquartil não sofrem essa influência.</w:t>
       </w:r>
     </w:p>
     <w:p>
@@ -5484,23 +4814,7 @@
         <w:jc w:val="both"/>
       </w:pPr>
       <w:r>
-        <w:t xml:space="preserve">Criamos três variáveis, todas por fórmula fixa e usando dados da própria linha. A variável hora saiu da coluna de horário, que era texto, porque a análise mostrou diferença grande ao longo do dia: 8,47% de gravidade às 23 horas contra 2,39% às 8 horas. A variável </w:t>
-      </w:r>
-      <w:proofErr w:type="spellStart"/>
-      <w:r>
-        <w:t>mes</w:t>
-      </w:r>
-      <w:proofErr w:type="spellEnd"/>
-      <w:r>
-        <w:t xml:space="preserve"> saiu da data, para testar sazonalidade, hipótese que não se confirmou. A variável </w:t>
-      </w:r>
-      <w:proofErr w:type="spellStart"/>
-      <w:r>
-        <w:t>ocupacao</w:t>
-      </w:r>
-      <w:proofErr w:type="spellEnd"/>
-      <w:r>
-        <w:t xml:space="preserve"> é a razão entre pessoas e veículos.</w:t>
+        <w:t xml:space="preserve">Criamos três variáveis, todas por fórmula fixa e usando dados da própria linha. A variável hora saiu da coluna de horário, que era texto, porque a análise mostrou diferença grande ao longo do dia: 8,47% de gravidade às 23 horas contra 2,39% às 8 horas. A variável mes saiu da data, para testar sazonalidade, hipótese que não se confirmou. A variável ocupacao é a razão entre pessoas e veículos.</w:t>
       </w:r>
     </w:p>
     <w:p>
@@ -5784,23 +5098,7 @@
                 <w:sz w:val="20"/>
                 <w:szCs w:val="20"/>
               </w:rPr>
-              <w:t xml:space="preserve">O parâmetro </w:t>
-            </w:r>
-            <w:proofErr w:type="spellStart"/>
-            <w:r>
-              <w:rPr>
-                <w:sz w:val="20"/>
-                <w:szCs w:val="20"/>
-              </w:rPr>
-              <w:t>class_weight</w:t>
-            </w:r>
-            <w:proofErr w:type="spellEnd"/>
-            <w:r>
-              <w:rPr>
-                <w:sz w:val="20"/>
-                <w:szCs w:val="20"/>
-              </w:rPr>
-              <w:t xml:space="preserve"> torna o erro sobre um acidente fatal cerca de vinte e três vezes mais caro que o erro sobre um acidente comum</w:t>
+              <w:t xml:space="preserve">O parâmetro class_weight torna o erro sobre um acidente fatal cerca de vinte e três vezes mais caro que o erro sobre um acidente comum</w:t>
             </w:r>
           </w:p>
         </w:tc>
@@ -5871,23 +5169,7 @@
                 <w:sz w:val="20"/>
                 <w:szCs w:val="20"/>
               </w:rPr>
-              <w:t xml:space="preserve">A </w:t>
-            </w:r>
-            <w:proofErr w:type="spellStart"/>
-            <w:r>
-              <w:rPr>
-                <w:sz w:val="20"/>
-                <w:szCs w:val="20"/>
-              </w:rPr>
-              <w:t>subamostragem</w:t>
-            </w:r>
-            <w:proofErr w:type="spellEnd"/>
-            <w:r>
-              <w:rPr>
-                <w:sz w:val="20"/>
-                <w:szCs w:val="20"/>
-              </w:rPr>
-              <w:t xml:space="preserve"> descarta acidentes não graves até as classes empatarem, reduzindo o treino de 31.663 para 2.600 registros; o SMOTE faz o oposto, criando acidentes fatais sintéticos por interpolação</w:t>
+              <w:t xml:space="preserve">A subamostragem descarta acidentes não graves até as classes empatarem, reduzindo o treino de 31.663 para 2.600 registros; o SMOTE faz o oposto, criando acidentes fatais sintéticos por interpolação</w:t>
             </w:r>
           </w:p>
         </w:tc>
@@ -5945,15 +5227,7 @@
         <w:jc w:val="both"/>
       </w:pPr>
       <w:r>
-        <w:t xml:space="preserve">Um cuidado vale ser destacado: a reamostragem foi declarada como uma etapa do pipeline, e não aplicada sobre a tabela inteira antes do treino. Assim ela roda apenas nas partes de treino de cada divisão da validação cruzada. Se fosse aplicada antes, as partes de avaliação conteriam registros sintéticos ou perderiam registros reais, e as métricas de validação não representariam o que acontece com dados novos. O conjunto de teste nunca é </w:t>
-      </w:r>
-      <w:proofErr w:type="spellStart"/>
-      <w:r>
-        <w:t>reamostrado</w:t>
-      </w:r>
-      <w:proofErr w:type="spellEnd"/>
-      <w:r>
-        <w:t xml:space="preserve"> e mantém a proporção real de 4,57% de acidentes fatais.</w:t>
+        <w:t xml:space="preserve">Um cuidado vale ser destacado: a reamostragem foi declarada como uma etapa do pipeline, e não aplicada sobre a tabela inteira antes do treino. Assim ela roda apenas nas partes de treino de cada divisão da validação cruzada. Se fosse aplicada antes, as partes de avaliação conteriam registros sintéticos ou perderiam registros reais, e as métricas de validação não representariam o que acontece com dados novos. O conjunto de teste nunca é reamostrado e mantém a proporção real de 4,57% de acidentes fatais.</w:t>
       </w:r>
     </w:p>
     <w:p>
@@ -5982,39 +5256,7 @@
         <w:jc w:val="both"/>
       </w:pPr>
       <w:r>
-        <w:t xml:space="preserve">Usamos a biblioteca </w:t>
-      </w:r>
-      <w:proofErr w:type="spellStart"/>
-      <w:r>
-        <w:t>scikit-learn</w:t>
-      </w:r>
-      <w:proofErr w:type="spellEnd"/>
-      <w:r>
-        <w:t xml:space="preserve"> (PEDREGOSA et al., 2011) em Python, no Google Colab. As transformações ficaram dentro de um </w:t>
-      </w:r>
-      <w:proofErr w:type="spellStart"/>
-      <w:r>
-        <w:t>ColumnTransformer</w:t>
-      </w:r>
-      <w:proofErr w:type="spellEnd"/>
-      <w:r>
-        <w:t xml:space="preserve">, que aplica o </w:t>
-      </w:r>
-      <w:proofErr w:type="spellStart"/>
-      <w:r>
-        <w:t>RobustScaler</w:t>
-      </w:r>
-      <w:proofErr w:type="spellEnd"/>
-      <w:r>
-        <w:t xml:space="preserve"> nas seis variáveis numéricas e o </w:t>
-      </w:r>
-      <w:proofErr w:type="spellStart"/>
-      <w:r>
-        <w:t>OneHotEncoder</w:t>
-      </w:r>
-      <w:proofErr w:type="spellEnd"/>
-      <w:r>
-        <w:t xml:space="preserve"> nas dez categóricas, gerando uma matriz de 89 colunas.</w:t>
+        <w:t xml:space="preserve">Usamos a biblioteca scikit-learn (PEDREGOSA et al., 2011) em Python, no Google Colab. As transformações ficaram dentro de um ColumnTransformer, que aplica o RobustScaler nas seis variáveis numéricas e o OneHotEncoder nas dez categóricas, gerando uma matriz de 89 colunas.</w:t>
       </w:r>
     </w:p>
     <w:p>
@@ -6035,23 +5277,7 @@
       </w:pPr>
       <w:r>
         <w:lastRenderedPageBreak/>
-        <w:t xml:space="preserve">Otimizamos os dois modelos com </w:t>
-      </w:r>
-      <w:proofErr w:type="spellStart"/>
-      <w:r>
-        <w:t>GridSearchCV</w:t>
-      </w:r>
-      <w:proofErr w:type="spellEnd"/>
-      <w:r>
-        <w:t xml:space="preserve">, que testa as combinações de </w:t>
-      </w:r>
-      <w:proofErr w:type="spellStart"/>
-      <w:r>
-        <w:t>hiperparâmetros</w:t>
-      </w:r>
-      <w:proofErr w:type="spellEnd"/>
-      <w:r>
-        <w:t xml:space="preserve"> usando validação cruzada, tendo o F1 da classe positiva como critério.</w:t>
+        <w:t xml:space="preserve">Otimizamos os dois modelos com GridSearchCV, que testa as combinações de hiperparâmetros usando validação cruzada, tendo o F1 da classe positiva como critério. Otimizar diretamente pela revocação levaria o modelo a sinalizar quase todos os acidentes como graves, a forma mais fácil de não perder nenhum positivo. O F1 exige revocação e precisão ao mesmo tempo e evita essa solução degenerada; a leitura final do resultado, no entanto, é feita pela revocação, com a precisão como controle.</w:t>
       </w:r>
     </w:p>
     <w:p>
@@ -6061,39 +5287,7 @@
         <w:jc w:val="both"/>
       </w:pPr>
       <w:r>
-        <w:t xml:space="preserve">As duas técnicas de reamostragem descritas na Seção 4.2.6 foram combinadas com os dois modelos, gerando quatro configurações além do Modelo A. A escolha entre elas usou somente o treino: como o F1 na validação ficou próximo, o desempate foi a diferença entre o F1 no treino e o F1 na validação, que mede o quanto o modelo decorou. No KNN, o F1 no treino ficou 0,007 abaixo do de validação com a </w:t>
-      </w:r>
-      <w:proofErr w:type="spellStart"/>
-      <w:r>
-        <w:t>subamostragem</w:t>
-      </w:r>
-      <w:proofErr w:type="spellEnd"/>
-      <w:r>
-        <w:t xml:space="preserve"> e 0,186 acima com o SMOTE, o que indica memorização no segundo caso. Por isso o Modelo B ficou com a </w:t>
-      </w:r>
-      <w:proofErr w:type="spellStart"/>
-      <w:r>
-        <w:t>subamostragem</w:t>
-      </w:r>
-      <w:proofErr w:type="spellEnd"/>
-      <w:r>
-        <w:t xml:space="preserve">, a mesma técnica de </w:t>
-      </w:r>
-      <w:proofErr w:type="spellStart"/>
-      <w:r>
-        <w:t>Mafort</w:t>
-      </w:r>
-      <w:proofErr w:type="spellEnd"/>
-      <w:r>
-        <w:t xml:space="preserve"> e </w:t>
-      </w:r>
-      <w:proofErr w:type="spellStart"/>
-      <w:r>
-        <w:t>Kappel</w:t>
-      </w:r>
-      <w:proofErr w:type="spellEnd"/>
-      <w:r>
-        <w:t xml:space="preserve"> (2025). Ele terminou com dezoito vizinhos e distância de Manhattan, praticamente a configuração encontrada por esses autores.</w:t>
+        <w:t xml:space="preserve">As duas técnicas de reamostragem descritas na Seção 4.2.6 foram combinadas com os dois modelos, gerando quatro configurações além do Modelo A. A escolha entre elas usou somente o treino: como o F1 na validação ficou próximo, o desempate foi a diferença entre o F1 no treino e o F1 na validação, que mede o quanto o modelo decorou. No KNN, o F1 no treino ficou 0,007 abaixo do de validação com a subamostragem e 0,186 acima com o SMOTE, o que indica memorização no segundo caso. Por isso o Modelo B ficou com a subamostragem, a mesma técnica de Mafort e Kappel (2025). Ele terminou com dezoito vizinhos e distância de Manhattan, praticamente a configuração encontrada por esses autores.</w:t>
       </w:r>
     </w:p>
     <w:p>
@@ -6103,31 +5297,7 @@
         <w:jc w:val="both"/>
       </w:pPr>
       <w:r>
-        <w:t xml:space="preserve">Na Regressão Logística testamos o parâmetro C nos valores 0,01, 0,1, 1 e 10, e ficamos com 0,1. Deixamos o </w:t>
-      </w:r>
-      <w:proofErr w:type="spellStart"/>
-      <w:r>
-        <w:t>class_weight</w:t>
-      </w:r>
-      <w:proofErr w:type="spellEnd"/>
-      <w:r>
-        <w:t xml:space="preserve"> em </w:t>
-      </w:r>
-      <w:proofErr w:type="spellStart"/>
-      <w:r>
-        <w:t>balanced</w:t>
-      </w:r>
-      <w:proofErr w:type="spellEnd"/>
-      <w:r>
-        <w:t xml:space="preserve">, que dá peso inversamente proporcional à frequência de cada classe: errar um caso grave passa a custar cerca de vinte e três vezes mais. No KNN testamos 5, 15 e 25 vizinhos com ponderação uniforme e por distância, ficando com 5 e uniforme. O KNN não tem parâmetro equivalente ao </w:t>
-      </w:r>
-      <w:proofErr w:type="spellStart"/>
-      <w:r>
-        <w:t>class_weight</w:t>
-      </w:r>
-      <w:proofErr w:type="spellEnd"/>
-      <w:r>
-        <w:t>.</w:t>
+        <w:t xml:space="preserve">Na Regressão Logística testamos o parâmetro C nos valores 0,01, 0,1, 1 e 10, e ficamos com 0,1. Deixamos o class_weight em balanced, que dá peso inversamente proporcional à frequência de cada classe: errar um caso grave passa a custar cerca de vinte e três vezes mais. No KNN testamos 5, 15 e 25 vizinhos com ponderação uniforme e por distância, ficando com 5 e uniforme. O KNN não tem parâmetro equivalente ao class_weight.</w:t>
       </w:r>
     </w:p>
     <w:p>
@@ -6155,7 +5325,7 @@
         <w:jc w:val="both"/>
       </w:pPr>
       <w:r>
-        <w:t>Deixamos a acurácia de fora como métrica principal. Para mostrar o motivo na prática, avaliamos um classificador que responde sempre a classe mais comum. Ele chegou a 95,9% de acurácia, com revocação zero e área sob a curva ROC de 0,500, o mesmo valor de quem decide por sorteio. Ou seja, acerta quase tudo sem encontrar nenhum acidente fatal.</w:t>
+        <w:t>Deixamos a acurácia de fora como métrica principal. Para mostrar o motivo na prática, avaliamos um classificador de referência (baseline) que responde sempre a classe mais comum. Ele chegou a 95,9% de acurácia, com revocação zero e área sob a curva ROC de 0,500, o mesmo valor de quem decide por sorteio. Ou seja, acerta quase tudo sem encontrar nenhum acidente fatal.</w:t>
       </w:r>
     </w:p>
     <w:p>
@@ -6165,7 +5335,7 @@
         <w:jc w:val="both"/>
       </w:pPr>
       <w:r>
-        <w:t>A métrica principal passou a ser a revocação da classe positiva, que mede quantos dos acidentes fatais o modelo encontrou. O motivo é o custo dos erros: deixar de sinalizar uma condição ligada a acidente fatal é pior do que dar um alarme falso. Usamos o F1 e a área sob a curva ROC como métricas de apoio. A acurácia continua reportada nos resultados, mas não foi usada para escolher o modelo.</w:t>
+        <w:t>A métrica principal passou a ser a revocação da classe positiva, que mede quantos dos acidentes fatais o modelo encontrou. O motivo é o custo dos erros: deixar de sinalizar uma condição ligada a acidente fatal é pior do que dar um alarme falso. Usamos o F1 e a área sob a curva ROC como métricas de apoio. A precisão funcionou como métrica de controle: ela mostra o custo dos falsos positivos e impede que a revocação seja inflada com o modelo acusando quase todos os acidentes. A acurácia continua reportada nos resultados, mas não foi usada para escolher o modelo.</w:t>
       </w:r>
     </w:p>
     <w:p>
@@ -6546,17 +5716,8 @@
                 <w:sz w:val="20"/>
                 <w:szCs w:val="20"/>
               </w:rPr>
-              <w:t xml:space="preserve">Logística com </w:t>
-            </w:r>
-            <w:proofErr w:type="spellStart"/>
-            <w:r>
-              <w:rPr>
-                <w:sz w:val="20"/>
-                <w:szCs w:val="20"/>
-              </w:rPr>
-              <w:t>subamostragem</w:t>
-            </w:r>
-            <w:proofErr w:type="spellEnd"/>
+              <w:t xml:space="preserve">Logística com subamostragem</w:t>
+            </w:r>
           </w:p>
         </w:tc>
         <w:tc>
@@ -6835,23 +5996,7 @@
                 <w:sz w:val="20"/>
                 <w:szCs w:val="20"/>
               </w:rPr>
-              <w:t xml:space="preserve">KNN com </w:t>
-            </w:r>
-            <w:proofErr w:type="spellStart"/>
-            <w:r>
-              <w:rPr>
-                <w:sz w:val="20"/>
-                <w:szCs w:val="20"/>
-              </w:rPr>
-              <w:t>subamostragem</w:t>
-            </w:r>
-            <w:proofErr w:type="spellEnd"/>
-            <w:r>
-              <w:rPr>
-                <w:sz w:val="20"/>
-                <w:szCs w:val="20"/>
-              </w:rPr>
-              <w:t xml:space="preserve"> (B)</w:t>
+              <w:t xml:space="preserve">KNN com subamostragem (B)</w:t>
             </w:r>
           </w:p>
         </w:tc>
@@ -7271,15 +6416,7 @@
         <w:jc w:val="both"/>
       </w:pPr>
       <w:r>
-        <w:t xml:space="preserve">A última linha mostra o KNN sem balanceamento: a maior acurácia da tabela junto com a pior revocação, o que repete a distorção do classificador trivial. Equilibrar o treino corrigiu esse comportamento, e a </w:t>
-      </w:r>
-      <w:proofErr w:type="spellStart"/>
-      <w:r>
-        <w:t>subamostragem</w:t>
-      </w:r>
-      <w:proofErr w:type="spellEnd"/>
-      <w:r>
-        <w:t xml:space="preserve"> levou a revocação de 0,070 para 0,650, contra 0,471 do SMOTE.</w:t>
+        <w:t xml:space="preserve">A última linha mostra o KNN sem balanceamento: a maior acurácia da tabela junto com a pior revocação, o que repete a distorção do classificador trivial. Equilibrar o treino corrigiu esse comportamento, e a subamostragem levou a revocação de 0,070 para 0,650, contra 0,471 do SMOTE.</w:t>
       </w:r>
     </w:p>
     <w:p>
@@ -7299,7 +6436,550 @@
         <w:jc w:val="both"/>
       </w:pPr>
       <w:r>
-        <w:t>A matriz de confusão, na Figura 4, compara os dois modelos escolhidos: dos 374 acidentes fatais de 2025, a Regressão Logística encontrou 270 e o KNN encontrou 243. Em troca, a Regressão Logística deu 1.503 alarmes falsos contra 1.373 do KNN.</w:t>
+        <w:t>A matriz de confusão, na Figura 4, compara os dois modelos escolhidos: dos 374 acidentes fatais de 2025, a Regressão Logística encontrou 270 e o KNN encontrou 243. Em troca, a Regressão Logística deu 1.503 alarmes falsos contra 1.373 do KNN. Com o acidente fatal como classe positiva, a Tabela 7 mostra as quatro células da matriz para os dois modelos.</w:t>
+      </w:r>
+    </w:p>
+    <w:p>
+      <w:pPr>
+        <w:keepNext/>
+        <w:spacing w:before="200" w:after="80"/>
+      </w:pPr>
+      <w:r>
+        <w:rPr>
+          <w:b/>
+          <w:bCs/>
+          <w:sz w:val="20"/>
+          <w:szCs w:val="20"/>
+        </w:rPr>
+        <w:t>Tabela 7 – Células da matriz de confusão no conjunto de teste</w:t>
+      </w:r>
+    </w:p>
+    <w:tbl>
+      <w:tblPr>
+        <w:tblStyle w:val="a0"/>
+        <w:tblW w:w="10071" w:type="dxa"/>
+        <w:tblInd w:w="0" w:type="dxa"/>
+        <w:tblBorders>
+          <w:top w:val="single" w:sz="4" w:space="0" w:color="000000"/>
+          <w:left w:val="single" w:sz="4" w:space="0" w:color="000000"/>
+          <w:bottom w:val="single" w:sz="4" w:space="0" w:color="000000"/>
+          <w:right w:val="single" w:sz="4" w:space="0" w:color="000000"/>
+          <w:insideH w:val="single" w:sz="4" w:space="0" w:color="000000"/>
+          <w:insideV w:val="single" w:sz="4" w:space="0" w:color="000000"/>
+        </w:tblBorders>
+        <w:tblLayout w:type="fixed"/>
+        <w:tblLook w:val="0000" w:firstRow="0" w:lastRow="0" w:firstColumn="0" w:lastColumn="0" w:noHBand="0" w:noVBand="0"/>
+      </w:tblPr>
+      <w:tblGrid>
+        <w:gridCol w:w="1300"/>
+        <w:gridCol w:w="4500"/>
+        <w:gridCol w:w="2135"/>
+        <w:gridCol w:w="2136"/>
+      </w:tblGrid>
+      <w:tr>
+        <w:trPr>
+          <w:cantSplit/>
+          <w:tblHeader/>
+        </w:trPr>
+        <w:tc>
+          <w:tcPr>
+            <w:tcW w:w="1300" w:type="dxa"/>
+            <w:shd w:val="clear" w:color="auto" w:fill="E8E8E8"/>
+            <w:tcMar>
+              <w:top w:w="60" w:type="dxa"/>
+              <w:left w:w="80" w:type="dxa"/>
+              <w:bottom w:w="60" w:type="dxa"/>
+              <w:right w:w="80" w:type="dxa"/>
+            </w:tcMar>
+          </w:tcPr>
+          <w:p>
+            <w:pPr>
+              <w:jc w:val="center"/>
+            </w:pPr>
+            <w:r>
+              <w:rPr>
+                <w:b/>
+                <w:bCs/>
+                <w:sz w:val="20"/>
+                <w:szCs w:val="20"/>
+              </w:rPr>
+              <w:t xml:space="preserve">Célula</w:t>
+            </w:r>
+          </w:p>
+        </w:tc>
+        <w:tc>
+          <w:tcPr>
+            <w:tcW w:w="4500" w:type="dxa"/>
+            <w:shd w:val="clear" w:color="auto" w:fill="E8E8E8"/>
+            <w:tcMar>
+              <w:top w:w="60" w:type="dxa"/>
+              <w:left w:w="80" w:type="dxa"/>
+              <w:bottom w:w="60" w:type="dxa"/>
+              <w:right w:w="80" w:type="dxa"/>
+            </w:tcMar>
+          </w:tcPr>
+          <w:p>
+            <w:r>
+              <w:rPr>
+                <w:b/>
+                <w:bCs/>
+                <w:sz w:val="20"/>
+                <w:szCs w:val="20"/>
+              </w:rPr>
+              <w:t xml:space="preserve">Significado</w:t>
+            </w:r>
+          </w:p>
+        </w:tc>
+        <w:tc>
+          <w:tcPr>
+            <w:tcW w:w="2135" w:type="dxa"/>
+            <w:shd w:val="clear" w:color="auto" w:fill="E8E8E8"/>
+            <w:tcMar>
+              <w:top w:w="60" w:type="dxa"/>
+              <w:left w:w="80" w:type="dxa"/>
+              <w:bottom w:w="60" w:type="dxa"/>
+              <w:right w:w="80" w:type="dxa"/>
+            </w:tcMar>
+          </w:tcPr>
+          <w:p>
+            <w:pPr>
+              <w:jc w:val="center"/>
+            </w:pPr>
+            <w:r>
+              <w:rPr>
+                <w:b/>
+                <w:bCs/>
+                <w:sz w:val="20"/>
+                <w:szCs w:val="20"/>
+              </w:rPr>
+              <w:t xml:space="preserve">Regressão Logística</w:t>
+            </w:r>
+          </w:p>
+        </w:tc>
+        <w:tc>
+          <w:tcPr>
+            <w:tcW w:w="2136" w:type="dxa"/>
+            <w:shd w:val="clear" w:color="auto" w:fill="E8E8E8"/>
+            <w:tcMar>
+              <w:top w:w="60" w:type="dxa"/>
+              <w:left w:w="80" w:type="dxa"/>
+              <w:bottom w:w="60" w:type="dxa"/>
+              <w:right w:w="80" w:type="dxa"/>
+            </w:tcMar>
+          </w:tcPr>
+          <w:p>
+            <w:pPr>
+              <w:jc w:val="center"/>
+            </w:pPr>
+            <w:r>
+              <w:rPr>
+                <w:b/>
+                <w:bCs/>
+                <w:sz w:val="20"/>
+                <w:szCs w:val="20"/>
+              </w:rPr>
+              <w:t xml:space="preserve">KNN</w:t>
+            </w:r>
+          </w:p>
+        </w:tc>
+      </w:tr>
+      <w:tr>
+        <w:trPr>
+          <w:cantSplit/>
+        </w:trPr>
+        <w:tc>
+          <w:tcPr>
+            <w:tcW w:w="1300" w:type="dxa"/>
+            <w:tcMar>
+              <w:top w:w="60" w:type="dxa"/>
+              <w:left w:w="80" w:type="dxa"/>
+              <w:bottom w:w="60" w:type="dxa"/>
+              <w:right w:w="80" w:type="dxa"/>
+            </w:tcMar>
+          </w:tcPr>
+          <w:p>
+            <w:pPr>
+              <w:jc w:val="center"/>
+            </w:pPr>
+            <w:r>
+              <w:rPr>
+                <w:sz w:val="20"/>
+                <w:szCs w:val="20"/>
+              </w:rPr>
+              <w:t xml:space="preserve">TP</w:t>
+            </w:r>
+          </w:p>
+        </w:tc>
+        <w:tc>
+          <w:tcPr>
+            <w:tcW w:w="4500" w:type="dxa"/>
+            <w:tcMar>
+              <w:top w:w="60" w:type="dxa"/>
+              <w:left w:w="80" w:type="dxa"/>
+              <w:bottom w:w="60" w:type="dxa"/>
+              <w:right w:w="80" w:type="dxa"/>
+            </w:tcMar>
+          </w:tcPr>
+          <w:p>
+            <w:r>
+              <w:rPr>
+                <w:sz w:val="20"/>
+                <w:szCs w:val="20"/>
+              </w:rPr>
+              <w:t xml:space="preserve">Acidente fatal que o modelo classificou como grave</w:t>
+            </w:r>
+          </w:p>
+        </w:tc>
+        <w:tc>
+          <w:tcPr>
+            <w:tcW w:w="2135" w:type="dxa"/>
+            <w:tcMar>
+              <w:top w:w="60" w:type="dxa"/>
+              <w:left w:w="80" w:type="dxa"/>
+              <w:bottom w:w="60" w:type="dxa"/>
+              <w:right w:w="80" w:type="dxa"/>
+            </w:tcMar>
+          </w:tcPr>
+          <w:p>
+            <w:pPr>
+              <w:jc w:val="center"/>
+            </w:pPr>
+            <w:r>
+              <w:rPr>
+                <w:sz w:val="20"/>
+                <w:szCs w:val="20"/>
+              </w:rPr>
+              <w:t xml:space="preserve">270</w:t>
+            </w:r>
+          </w:p>
+        </w:tc>
+        <w:tc>
+          <w:tcPr>
+            <w:tcW w:w="2136" w:type="dxa"/>
+            <w:tcMar>
+              <w:top w:w="60" w:type="dxa"/>
+              <w:left w:w="80" w:type="dxa"/>
+              <w:bottom w:w="60" w:type="dxa"/>
+              <w:right w:w="80" w:type="dxa"/>
+            </w:tcMar>
+          </w:tcPr>
+          <w:p>
+            <w:pPr>
+              <w:jc w:val="center"/>
+            </w:pPr>
+            <w:r>
+              <w:rPr>
+                <w:sz w:val="20"/>
+                <w:szCs w:val="20"/>
+              </w:rPr>
+              <w:t xml:space="preserve">243</w:t>
+            </w:r>
+          </w:p>
+        </w:tc>
+      </w:tr>
+      <w:tr>
+        <w:trPr>
+          <w:cantSplit/>
+        </w:trPr>
+        <w:tc>
+          <w:tcPr>
+            <w:tcW w:w="1300" w:type="dxa"/>
+            <w:tcMar>
+              <w:top w:w="60" w:type="dxa"/>
+              <w:left w:w="80" w:type="dxa"/>
+              <w:bottom w:w="60" w:type="dxa"/>
+              <w:right w:w="80" w:type="dxa"/>
+            </w:tcMar>
+          </w:tcPr>
+          <w:p>
+            <w:pPr>
+              <w:jc w:val="center"/>
+            </w:pPr>
+            <w:r>
+              <w:rPr>
+                <w:sz w:val="20"/>
+                <w:szCs w:val="20"/>
+              </w:rPr>
+              <w:t xml:space="preserve">FN</w:t>
+            </w:r>
+          </w:p>
+        </w:tc>
+        <w:tc>
+          <w:tcPr>
+            <w:tcW w:w="4500" w:type="dxa"/>
+            <w:tcMar>
+              <w:top w:w="60" w:type="dxa"/>
+              <w:left w:w="80" w:type="dxa"/>
+              <w:bottom w:w="60" w:type="dxa"/>
+              <w:right w:w="80" w:type="dxa"/>
+            </w:tcMar>
+          </w:tcPr>
+          <w:p>
+            <w:r>
+              <w:rPr>
+                <w:sz w:val="20"/>
+                <w:szCs w:val="20"/>
+              </w:rPr>
+              <w:t xml:space="preserve">Acidente fatal que o modelo deixou passar</w:t>
+            </w:r>
+          </w:p>
+        </w:tc>
+        <w:tc>
+          <w:tcPr>
+            <w:tcW w:w="2135" w:type="dxa"/>
+            <w:tcMar>
+              <w:top w:w="60" w:type="dxa"/>
+              <w:left w:w="80" w:type="dxa"/>
+              <w:bottom w:w="60" w:type="dxa"/>
+              <w:right w:w="80" w:type="dxa"/>
+            </w:tcMar>
+          </w:tcPr>
+          <w:p>
+            <w:pPr>
+              <w:jc w:val="center"/>
+            </w:pPr>
+            <w:r>
+              <w:rPr>
+                <w:sz w:val="20"/>
+                <w:szCs w:val="20"/>
+              </w:rPr>
+              <w:t xml:space="preserve">104</w:t>
+            </w:r>
+          </w:p>
+        </w:tc>
+        <w:tc>
+          <w:tcPr>
+            <w:tcW w:w="2136" w:type="dxa"/>
+            <w:tcMar>
+              <w:top w:w="60" w:type="dxa"/>
+              <w:left w:w="80" w:type="dxa"/>
+              <w:bottom w:w="60" w:type="dxa"/>
+              <w:right w:w="80" w:type="dxa"/>
+            </w:tcMar>
+          </w:tcPr>
+          <w:p>
+            <w:pPr>
+              <w:jc w:val="center"/>
+            </w:pPr>
+            <w:r>
+              <w:rPr>
+                <w:sz w:val="20"/>
+                <w:szCs w:val="20"/>
+              </w:rPr>
+              <w:t xml:space="preserve">131</w:t>
+            </w:r>
+          </w:p>
+        </w:tc>
+      </w:tr>
+      <w:tr>
+        <w:trPr>
+          <w:cantSplit/>
+        </w:trPr>
+        <w:tc>
+          <w:tcPr>
+            <w:tcW w:w="1300" w:type="dxa"/>
+            <w:tcMar>
+              <w:top w:w="60" w:type="dxa"/>
+              <w:left w:w="80" w:type="dxa"/>
+              <w:bottom w:w="60" w:type="dxa"/>
+              <w:right w:w="80" w:type="dxa"/>
+            </w:tcMar>
+          </w:tcPr>
+          <w:p>
+            <w:pPr>
+              <w:jc w:val="center"/>
+            </w:pPr>
+            <w:r>
+              <w:rPr>
+                <w:sz w:val="20"/>
+                <w:szCs w:val="20"/>
+              </w:rPr>
+              <w:t xml:space="preserve">FP</w:t>
+            </w:r>
+          </w:p>
+        </w:tc>
+        <w:tc>
+          <w:tcPr>
+            <w:tcW w:w="4500" w:type="dxa"/>
+            <w:tcMar>
+              <w:top w:w="60" w:type="dxa"/>
+              <w:left w:w="80" w:type="dxa"/>
+              <w:bottom w:w="60" w:type="dxa"/>
+              <w:right w:w="80" w:type="dxa"/>
+            </w:tcMar>
+          </w:tcPr>
+          <w:p>
+            <w:r>
+              <w:rPr>
+                <w:sz w:val="20"/>
+                <w:szCs w:val="20"/>
+              </w:rPr>
+              <w:t xml:space="preserve">Acidente não fatal classificado como grave (alarme falso)</w:t>
+            </w:r>
+          </w:p>
+        </w:tc>
+        <w:tc>
+          <w:tcPr>
+            <w:tcW w:w="2135" w:type="dxa"/>
+            <w:tcMar>
+              <w:top w:w="60" w:type="dxa"/>
+              <w:left w:w="80" w:type="dxa"/>
+              <w:bottom w:w="60" w:type="dxa"/>
+              <w:right w:w="80" w:type="dxa"/>
+            </w:tcMar>
+          </w:tcPr>
+          <w:p>
+            <w:pPr>
+              <w:jc w:val="center"/>
+            </w:pPr>
+            <w:r>
+              <w:rPr>
+                <w:sz w:val="20"/>
+                <w:szCs w:val="20"/>
+              </w:rPr>
+              <w:t xml:space="preserve">1.503</w:t>
+            </w:r>
+          </w:p>
+        </w:tc>
+        <w:tc>
+          <w:tcPr>
+            <w:tcW w:w="2136" w:type="dxa"/>
+            <w:tcMar>
+              <w:top w:w="60" w:type="dxa"/>
+              <w:left w:w="80" w:type="dxa"/>
+              <w:bottom w:w="60" w:type="dxa"/>
+              <w:right w:w="80" w:type="dxa"/>
+            </w:tcMar>
+          </w:tcPr>
+          <w:p>
+            <w:pPr>
+              <w:jc w:val="center"/>
+            </w:pPr>
+            <w:r>
+              <w:rPr>
+                <w:sz w:val="20"/>
+                <w:szCs w:val="20"/>
+              </w:rPr>
+              <w:t xml:space="preserve">1.373</w:t>
+            </w:r>
+          </w:p>
+        </w:tc>
+      </w:tr>
+      <w:tr>
+        <w:trPr>
+          <w:cantSplit/>
+        </w:trPr>
+        <w:tc>
+          <w:tcPr>
+            <w:tcW w:w="1300" w:type="dxa"/>
+            <w:tcMar>
+              <w:top w:w="60" w:type="dxa"/>
+              <w:left w:w="80" w:type="dxa"/>
+              <w:bottom w:w="60" w:type="dxa"/>
+              <w:right w:w="80" w:type="dxa"/>
+            </w:tcMar>
+          </w:tcPr>
+          <w:p>
+            <w:pPr>
+              <w:jc w:val="center"/>
+            </w:pPr>
+            <w:r>
+              <w:rPr>
+                <w:sz w:val="20"/>
+                <w:szCs w:val="20"/>
+              </w:rPr>
+              <w:t xml:space="preserve">TN</w:t>
+            </w:r>
+          </w:p>
+        </w:tc>
+        <w:tc>
+          <w:tcPr>
+            <w:tcW w:w="4500" w:type="dxa"/>
+            <w:tcMar>
+              <w:top w:w="60" w:type="dxa"/>
+              <w:left w:w="80" w:type="dxa"/>
+              <w:bottom w:w="60" w:type="dxa"/>
+              <w:right w:w="80" w:type="dxa"/>
+            </w:tcMar>
+          </w:tcPr>
+          <w:p>
+            <w:r>
+              <w:rPr>
+                <w:sz w:val="20"/>
+                <w:szCs w:val="20"/>
+              </w:rPr>
+              <w:t xml:space="preserve">Acidente não fatal classificado corretamente</w:t>
+            </w:r>
+          </w:p>
+        </w:tc>
+        <w:tc>
+          <w:tcPr>
+            <w:tcW w:w="2135" w:type="dxa"/>
+            <w:tcMar>
+              <w:top w:w="60" w:type="dxa"/>
+              <w:left w:w="80" w:type="dxa"/>
+              <w:bottom w:w="60" w:type="dxa"/>
+              <w:right w:w="80" w:type="dxa"/>
+            </w:tcMar>
+          </w:tcPr>
+          <w:p>
+            <w:pPr>
+              <w:jc w:val="center"/>
+            </w:pPr>
+            <w:r>
+              <w:rPr>
+                <w:sz w:val="20"/>
+                <w:szCs w:val="20"/>
+              </w:rPr>
+              <w:t xml:space="preserve">6.309</w:t>
+            </w:r>
+          </w:p>
+        </w:tc>
+        <w:tc>
+          <w:tcPr>
+            <w:tcW w:w="2136" w:type="dxa"/>
+            <w:tcMar>
+              <w:top w:w="60" w:type="dxa"/>
+              <w:left w:w="80" w:type="dxa"/>
+              <w:bottom w:w="60" w:type="dxa"/>
+              <w:right w:w="80" w:type="dxa"/>
+            </w:tcMar>
+          </w:tcPr>
+          <w:p>
+            <w:pPr>
+              <w:jc w:val="center"/>
+            </w:pPr>
+            <w:r>
+              <w:rPr>
+                <w:sz w:val="20"/>
+                <w:szCs w:val="20"/>
+              </w:rPr>
+              <w:t xml:space="preserve">6.439</w:t>
+            </w:r>
+          </w:p>
+        </w:tc>
+      </w:tr>
+    </w:tbl>
+    <w:p>
+      <w:pPr>
+        <w:spacing w:before="60" w:after="200"/>
+      </w:pPr>
+      <w:r>
+        <w:rPr>
+          <w:sz w:val="20"/>
+          <w:szCs w:val="20"/>
+        </w:rPr>
+        <w:t>Fonte: elaborado pelo autor.</w:t>
+      </w:r>
+    </w:p>
+    <w:p>
+      <w:pPr>
+        <w:spacing w:after="120" w:line="360" w:lineRule="auto"/>
+        <w:ind w:firstLine="709"/>
+        <w:jc w:val="both"/>
+      </w:pPr>
+      <w:r>
+        <w:t>As métricas saem dessas células: a revocação é TP ÷ (TP + FN) = 270 ÷ 374 = 0,722, e a precisão é TP ÷ (TP + FP) = 270 ÷ 1.773 = 0,152. Como o erro mais grave do problema é o falso negativo, o número de FN é o que mais pesa na comparação: a Regressão Logística deixa passar 104 acidentes fatais, contra 131 do KNN.</w:t>
       </w:r>
     </w:p>
     <w:p>
@@ -7384,15 +7064,7 @@
         <w:jc w:val="both"/>
       </w:pPr>
       <w:r>
-        <w:t xml:space="preserve">O desempenho do KNN sem balanceamento se explica pelo algoritmo. Ele responde pela maioria entre os vizinhos mais próximos, e com 4,11% de casos positivos é raro que a maioria dos vizinhos seja de acidentes fatais. Como o KNN não permite dar mais peso à classe rara, a correção precisou vir dos dados: com a </w:t>
-      </w:r>
-      <w:proofErr w:type="spellStart"/>
-      <w:r>
-        <w:t>subamostragem</w:t>
-      </w:r>
-      <w:proofErr w:type="spellEnd"/>
-      <w:r>
-        <w:t xml:space="preserve"> o treino passa de 31.663 para 2.600 registros, metade de cada classe, e os acidentes fatais deixam de ficar isolados entre casos comuns.</w:t>
+        <w:t xml:space="preserve">O desempenho do KNN sem balanceamento se explica pelo algoritmo. Ele responde pela maioria entre os vizinhos mais próximos, e com 4,11% de casos positivos é raro que a maioria dos vizinhos seja de acidentes fatais. Como o KNN não permite dar mais peso à classe rara, a correção precisou vir dos dados: com a subamostragem o treino passa de 31.663 para 2.600 registros, metade de cada classe, e os acidentes fatais deixam de ficar isolados entre casos comuns.</w:t>
       </w:r>
     </w:p>
     <w:p>
@@ -7486,13 +7158,8 @@
         <w:spacing w:before="240" w:after="160" w:line="360" w:lineRule="auto"/>
       </w:pPr>
       <w:r>
-        <w:t xml:space="preserve">4.4.3 </w:t>
-      </w:r>
-      <w:proofErr w:type="spellStart"/>
-      <w:r>
-        <w:t>Sobreajuste</w:t>
-      </w:r>
-      <w:proofErr w:type="spellEnd"/>
+        <w:t xml:space="preserve">4.4.3 Sobreajuste</w:t>
+      </w:r>
     </w:p>
     <w:p>
       <w:pPr>
@@ -7501,7 +7168,7 @@
         <w:jc w:val="both"/>
       </w:pPr>
       <w:r>
-        <w:t>Comparar o desempenho no treino e no teste mostra se o modelo generaliza, como na Tabela 5.</w:t>
+        <w:t>Comparar o desempenho no treino e no teste mostra se o modelo generaliza, como na Tabela 8.</w:t>
       </w:r>
     </w:p>
     <w:p>
@@ -7516,7 +7183,7 @@
           <w:sz w:val="20"/>
           <w:szCs w:val="20"/>
         </w:rPr>
-        <w:t>Tabela 7 – Comparação do F1 entre treino e teste</w:t>
+        <w:t>Tabela 8 – Comparação do F1 entre treino e teste</w:t>
       </w:r>
     </w:p>
     <w:tbl>
@@ -7712,17 +7379,8 @@
                 <w:sz w:val="20"/>
                 <w:szCs w:val="20"/>
               </w:rPr>
-              <w:t xml:space="preserve">KNN com </w:t>
-            </w:r>
-            <w:proofErr w:type="spellStart"/>
-            <w:r>
-              <w:rPr>
-                <w:sz w:val="20"/>
-                <w:szCs w:val="20"/>
-              </w:rPr>
-              <w:t>subamostragem</w:t>
-            </w:r>
-            <w:proofErr w:type="spellEnd"/>
+              <w:t xml:space="preserve">KNN com subamostragem</w:t>
+            </w:r>
           </w:p>
         </w:tc>
         <w:tc>
@@ -7934,15 +7592,7 @@
         <w:jc w:val="both"/>
       </w:pPr>
       <w:r>
-        <w:t xml:space="preserve">Os dois modelos escolhidos mantêm o desempenho em dados novos. As duas versões descartadas do KNN mostram os problemas opostos: sem balanceamento ele perde mais da metade, e com SMOTE cai de 0,436 para 0,245, porque aprendeu os pontos sintéticos que o próprio algoritmo criou. Essa diferença já aparecia na validação cruzada, feita apenas com o treino, e foi ela que orientou a escolha da </w:t>
-      </w:r>
-      <w:proofErr w:type="spellStart"/>
-      <w:r>
-        <w:t>subamostragem</w:t>
-      </w:r>
-      <w:proofErr w:type="spellEnd"/>
-      <w:r>
-        <w:t>.</w:t>
+        <w:t xml:space="preserve">Os dois modelos escolhidos mantêm o desempenho em dados novos. As duas versões descartadas do KNN mostram os problemas opostos: sem balanceamento ele perde mais da metade, e com SMOTE cai de 0,436 para 0,245, porque aprendeu os pontos sintéticos que o próprio algoritmo criou. Essa diferença já aparecia na validação cruzada, feita apenas com o treino, e foi ela que orientou a escolha da subamostragem.</w:t>
       </w:r>
     </w:p>
     <w:p>
@@ -7962,8 +7612,6 @@
       </w:pPr>
       <w:r>
         <w:t xml:space="preserve">A Regressão Logística devolve uma probabilidade, e o corte padrão para responder grave é 0,5. Alterar esse corte troca revocação por precisão. A Figura 6 </w:t>
-      </w:r>
-      <w:r>
         <w:lastRenderedPageBreak/>
         <w:t>mostra esse efeito, calculado apenas no treino, com as previsões de cada divisão da validação cruzada.</w:t>
       </w:r>
@@ -8049,15 +7697,7 @@
         <w:jc w:val="both"/>
       </w:pPr>
       <w:r>
-        <w:t xml:space="preserve">O F1 é maior perto do corte 0,8, com 0,357 contra 0,250 no corte padrão. Nesse ponto, porém, a revocação cai de 0,745 para 0,485, ou seja, o modelo deixaria passar mais da metade dos acidentes fatais. Como a prioridade é não deixar passar um caso fatal, mantivemos o corte em 0,5. A análise segue a recomendação de Fiorentini e </w:t>
-      </w:r>
-      <w:proofErr w:type="spellStart"/>
-      <w:r>
-        <w:t>Losa</w:t>
-      </w:r>
-      <w:proofErr w:type="spellEnd"/>
-      <w:r>
-        <w:t xml:space="preserve"> (2020) de avaliar o desempenho classe por classe.</w:t>
+        <w:t xml:space="preserve">O F1 é maior perto do corte 0,8, com 0,357 contra 0,250 no corte padrão. Nesse ponto, porém, a revocação cai de 0,745 para 0,485, ou seja, o modelo deixaria passar mais da metade dos acidentes fatais. Como a prioridade é não deixar passar um caso fatal, mantivemos o corte em 0,5. A análise segue a recomendação de Fiorentini e Losa (2020) de avaliar o desempenho classe por classe.</w:t>
       </w:r>
     </w:p>
     <w:p>
@@ -8076,7 +7716,7 @@
         <w:jc w:val="both"/>
       </w:pPr>
       <w:r>
-        <w:t>Os coeficientes da Regressão Logística permitem ordenar os atributos pela contribuição à gravidade estimada. A Tabela 8 mostra os maiores e os menores.</w:t>
+        <w:t>Os coeficientes da Regressão Logística permitem ordenar os atributos pela contribuição à gravidade estimada. A Tabela 9 mostra os maiores e os menores.</w:t>
       </w:r>
     </w:p>
     <w:p>
@@ -8091,7 +7731,7 @@
           <w:sz w:val="20"/>
           <w:szCs w:val="20"/>
         </w:rPr>
-        <w:t>Tabela 8 – Atributos de maior contribuição</w:t>
+        <w:t>Tabela 9 – Atributos de maior contribuição</w:t>
       </w:r>
     </w:p>
     <w:tbl>
@@ -8734,23 +8374,7 @@
         <w:jc w:val="both"/>
       </w:pPr>
       <w:r>
-        <w:t xml:space="preserve">Esses resultados podem ser comparados com os dos trabalhos relacionados, que também identificaram os fatores de maior peso. Em </w:t>
-      </w:r>
-      <w:proofErr w:type="spellStart"/>
-      <w:r>
-        <w:t>Mafort</w:t>
-      </w:r>
-      <w:proofErr w:type="spellEnd"/>
-      <w:r>
-        <w:t xml:space="preserve"> e </w:t>
-      </w:r>
-      <w:proofErr w:type="spellStart"/>
-      <w:r>
-        <w:t>Kappel</w:t>
-      </w:r>
-      <w:proofErr w:type="spellEnd"/>
-      <w:r>
-        <w:t xml:space="preserve"> (2025), com os mesmos dados da PRF em outro estado, o tipo de acidente foi o preditor mais influente, seguido da fase do dia e das condições meteorológicas. Aqui o tipo de acidente também domina: os dois maiores coeficientes, atropelamento de pedestre e colisão frontal, são categorias dessa variável, e a fase do dia aparece na análise exploratória, com 5,83% de gravidade em plena noite contra 2,92% em pleno dia. Em Gabardo et al. (2025), a pista simples aparece entre os fatores estruturais ligados às mortes, o que coincide com os 5,15% de gravidade em pista simples contra 2,49% em pista dupla no nosso conjunto de treino.</w:t>
+        <w:t xml:space="preserve">Esses resultados podem ser comparados com os dos trabalhos relacionados, que também identificaram os fatores de maior peso. Em Mafort e Kappel (2025), com os mesmos dados da PRF em outro estado, o tipo de acidente foi o preditor mais influente, seguido da fase do dia e das condições meteorológicas. Aqui o tipo de acidente também domina: os dois maiores coeficientes, atropelamento de pedestre e colisão frontal, são categorias dessa variável, e a fase do dia aparece na análise exploratória, com 5,83% de gravidade em plena noite contra 2,92% em pleno dia. Em Gabardo et al. (2025), a pista simples aparece entre os fatores estruturais ligados às mortes, o que coincide com os 5,15% de gravidade em pista simples contra 2,49% em pista dupla no nosso conjunto de treino.</w:t>
       </w:r>
     </w:p>
     <w:p>
@@ -8779,7 +8403,7 @@
         <w:jc w:val="both"/>
       </w:pPr>
       <w:r>
-        <w:t>Escolhemos a Regressão Logística como modelo final. Ela ganha em todas as métricas que importam para o problema: revocação de 0,722 contra 0,070, F1 de 0,252 contra 0,116 e área sob a curva ROC de 0,853 contra 0,657.</w:t>
+        <w:t>Escolhemos a Regressão Logística como modelo final. Ela supera o KNN nas duas métricas principais, com revocação de 0,722 contra 0,650 e área sob a curva ROC de 0,853 contra 0,810, e ainda permite ler quais fatores pesam na gravidade.</w:t>
       </w:r>
     </w:p>
     <w:p>
@@ -8789,23 +8413,7 @@
         <w:jc w:val="both"/>
       </w:pPr>
       <w:r>
-        <w:t xml:space="preserve">Sobre desempenho e </w:t>
-      </w:r>
-      <w:proofErr w:type="spellStart"/>
-      <w:r>
-        <w:t>interpretabilidade</w:t>
-      </w:r>
-      <w:proofErr w:type="spellEnd"/>
-      <w:r>
-        <w:t xml:space="preserve">, esperávamos ter que </w:t>
-      </w:r>
-      <w:proofErr w:type="gramStart"/>
-      <w:r>
-        <w:t>abrir mão de</w:t>
-      </w:r>
-      <w:proofErr w:type="gramEnd"/>
-      <w:r>
-        <w:t xml:space="preserve"> um para ganhar no outro, e isso não aconteceu. A Regressão Logística foi ao mesmo tempo a mais fácil de explicar, porque fornece coeficientes, e a de melhor desempenho. O KNN só se tornou competitivo depois que o treino foi equilibrado, e mesmo assim não fornece nenhuma explicação sobre as suas decisões.</w:t>
+        <w:t xml:space="preserve">Sobre desempenho e interpretabilidade, esperávamos ter que abrir mão de um para ganhar no outro, e isso não aconteceu. A Regressão Logística foi ao mesmo tempo a mais fácil de explicar, porque fornece coeficientes, e a de melhor desempenho. O KNN só se tornou competitivo depois que o treino foi equilibrado, e mesmo assim não fornece nenhuma explicação sobre as suas decisões.</w:t>
       </w:r>
     </w:p>
     <w:p>
@@ -8815,15 +8423,7 @@
       </w:pPr>
       <w:r>
         <w:lastRenderedPageBreak/>
-        <w:t xml:space="preserve">5 CONCLUSÃO, </w:t>
-      </w:r>
-      <w:proofErr w:type="gramStart"/>
-      <w:r>
-        <w:t>PRODUTO FINAL</w:t>
-      </w:r>
-      <w:proofErr w:type="gramEnd"/>
-      <w:r>
-        <w:t xml:space="preserve"> E CRONOGRAMA</w:t>
+        <w:t xml:space="preserve">5 CONCLUSÃO, PRODUTO FINAL E CRONOGRAMA</w:t>
       </w:r>
     </w:p>
     <w:p>
@@ -8852,15 +8452,17 @@
         <w:jc w:val="both"/>
       </w:pPr>
       <w:r>
-        <w:t xml:space="preserve">O modelo escolhido encontra cerca de 72% dos acidentes fatais do conjunto de teste, com área sob a curva ROC de 0,853. A análise dos coeficientes ordenou os fatores ligados à maior letalidade, informação que pode orientar decisões de fiscalização e sinalização. O KNN, depois do balanceamento por </w:t>
-      </w:r>
-      <w:proofErr w:type="spellStart"/>
-      <w:r>
-        <w:t>subamostragem</w:t>
-      </w:r>
-      <w:proofErr w:type="spellEnd"/>
-      <w:r>
-        <w:t>, chegou a 0,650 de revocação e 0,810 de área sob a curva, ficando abaixo da Regressão Logística e sem oferecer explicação sobre as decisões.</w:t>
+        <w:t xml:space="preserve">O modelo escolhido encontra cerca de 72% dos acidentes fatais do conjunto de teste, com área sob a curva ROC de 0,853. A análise dos coeficientes ordenou os fatores ligados à maior letalidade, informação que pode orientar decisões de fiscalização e sinalização. O KNN, depois do balanceamento por subamostragem, chegou a 0,650 de revocação e 0,810 de área sob a curva, ficando abaixo da Regressão Logística e sem oferecer explicação sobre as decisões.</w:t>
+      </w:r>
+    </w:p>
+    <w:p>
+      <w:pPr>
+        <w:spacing w:after="120" w:line="360" w:lineRule="auto"/>
+        <w:ind w:firstLine="709"/>
+        <w:jc w:val="both"/>
+      </w:pPr>
+      <w:r>
+        <w:t>O problema prioriza não deixar passar um acidente fatal, e por isso a revocação foi a métrica principal. Dos 374 acidentes fatais de 2025, o modelo deixou passar 104, os falsos negativos. O efeito colateral foi a precisão de 0,152, com 1.503 alarmes falsos, custo que consideramos aceitável quando o objetivo é priorizar fiscalização e intervenções. O resultado supera com folga o baseline que responde sempre não grave, que tem 95,9% de acurácia e revocação zero.</w:t>
       </w:r>
     </w:p>
     <w:p>
@@ -8889,15 +8491,7 @@
         <w:jc w:val="both"/>
       </w:pPr>
       <w:r>
-        <w:t xml:space="preserve">O modelo tem finalidade analítica. Ele identifica condições associadas à maior letalidade em acidentes já registrados e não serve para prever ocorrências em tempo real. As variáveis pessoas e </w:t>
-      </w:r>
-      <w:proofErr w:type="spellStart"/>
-      <w:r>
-        <w:t>veiculos</w:t>
-      </w:r>
-      <w:proofErr w:type="spellEnd"/>
-      <w:r>
-        <w:t>, por exemplo, só são conhecidas depois do acidente. Elas não são vazamento, porque o número de ocupantes independe do desfecho, mas limitam o uso do modelo.</w:t>
+        <w:t xml:space="preserve">O modelo tem finalidade analítica. Ele identifica condições associadas à maior letalidade em acidentes já registrados e não serve para prever ocorrências em tempo real. As variáveis pessoas e veiculos, por exemplo, só são conhecidas depois do acidente. Elas não são vazamento, porque o número de ocupantes independe do desfecho, mas limitam o uso do modelo.</w:t>
       </w:r>
     </w:p>
     <w:p>
@@ -8926,13 +8520,8 @@
         <w:spacing w:before="300" w:after="200" w:line="360" w:lineRule="auto"/>
       </w:pPr>
       <w:r>
-        <w:t xml:space="preserve">5.3 </w:t>
-      </w:r>
-      <w:proofErr w:type="gramStart"/>
-      <w:r>
-        <w:t>PRODUTO FINAL</w:t>
-      </w:r>
-      <w:proofErr w:type="gramEnd"/>
+        <w:t xml:space="preserve">5.3 PRODUTO FINAL</w:t>
+      </w:r>
     </w:p>
     <w:p>
       <w:pPr>
@@ -8942,30 +8531,7 @@
       </w:pPr>
       <w:r>
         <w:lastRenderedPageBreak/>
-        <w:t xml:space="preserve">O </w:t>
-      </w:r>
-      <w:proofErr w:type="gramStart"/>
-      <w:r>
-        <w:t>produto final</w:t>
-      </w:r>
-      <w:proofErr w:type="gramEnd"/>
-      <w:r>
-        <w:t xml:space="preserve"> tem </w:t>
-      </w:r>
-      <w:r>
-        <w:t>quatro</w:t>
-      </w:r>
-      <w:r>
-        <w:t xml:space="preserve"> partes: este documento, o notebook desenvolvido no Google Colab com a implementação comentada, </w:t>
-      </w:r>
-      <w:r>
-        <w:t xml:space="preserve">o aplicativo web para visualização dos resultados, e </w:t>
-      </w:r>
-      <w:r>
-        <w:t>o repositório de código, disponível em https://github.com/joao1824/projeto-ml-prf, com o notebook, os dados e as instruções para reproduzir o trabalho</w:t>
-      </w:r>
-      <w:r>
-        <w:t>.</w:t>
+        <w:t xml:space="preserve">O produto final tem quatro partes: este documento, o notebook desenvolvido no Google Colab com a implementação comentada, o aplicativo web para visualização dos resultados, e o repositório de código, disponível em https://github.com/joao1824/projeto-ml-prf, com o notebook, os dados e as instruções para reproduzir o trabalho.</w:t>
       </w:r>
     </w:p>
     <w:p>
@@ -8974,10 +8540,7 @@
         <w:spacing w:before="240" w:after="160" w:line="360" w:lineRule="auto"/>
       </w:pPr>
       <w:r>
-        <w:t xml:space="preserve">5.3.1 </w:t>
-      </w:r>
-      <w:r>
-        <w:t>Aplicação web para visualização dos resultados</w:t>
+        <w:t xml:space="preserve">5.3.1 Aplicação web para visualização dos resultados</w:t>
       </w:r>
     </w:p>
     <w:p>
@@ -8987,21 +8550,7 @@
         <w:jc w:val="both"/>
       </w:pPr>
       <w:r>
-        <w:t xml:space="preserve">Como complemento ao modelo desenvolvido, foi criada uma aplicação web em HTML, CSS e </w:t>
-      </w:r>
-      <w:proofErr w:type="spellStart"/>
-      <w:r>
-        <w:t>JavaScript</w:t>
-      </w:r>
-      <w:proofErr w:type="spellEnd"/>
-      <w:r>
-        <w:t xml:space="preserve"> para apresentar de forma mais dinâmica e intuitiva os resultados obtidos na etapa de previsão. A aplicação</w:t>
-      </w:r>
-      <w:r>
-        <w:t>, visível na Figura 7,</w:t>
-      </w:r>
-      <w:r>
-        <w:t xml:space="preserve"> foi desenvolvida a partir da proposta de visualização apresentada por Mattos et al. (2019), que demonstrou como dados abertos da Polícia Rodoviária Federal podem ser transformados em representações visuais capazes de facilitar a exploração dos registros e a identificação de padrões. Neste trabalho, entretanto, a visualização foi integrada diretamente aos resultados do modelo de Machine Learning, permitindo observar não apenas a distribuição espacial dos acidentes, mas também o comportamento das previsões realizadas.</w:t>
+        <w:t xml:space="preserve">Como complemento ao modelo desenvolvido, foi criada uma aplicação web em HTML, CSS e JavaScript para apresentar de forma mais dinâmica e intuitiva os resultados obtidos na etapa de previsão. A aplicação, visível na Figura 7, foi desenvolvida a partir da proposta de visualização apresentada por Mattos et al. (2019), que demonstrou como dados abertos da Polícia Rodoviária Federal podem ser transformados em representações visuais capazes de facilitar a exploração dos registros e a identificação de padrões. Neste trabalho, entretanto, a visualização foi integrada diretamente aos resultados do modelo de Machine Learning, permitindo observar não apenas a distribuição espacial dos acidentes, mas também o comportamento das previsões realizadas.</w:t>
       </w:r>
     </w:p>
     <w:p>
@@ -9085,25 +8634,7 @@
         <w:jc w:val="both"/>
       </w:pPr>
       <w:r>
-        <w:t xml:space="preserve">A aplicação apresenta </w:t>
-      </w:r>
-      <w:r>
-        <w:t>as</w:t>
-      </w:r>
-      <w:r>
-        <w:t xml:space="preserve"> localizações geográficas </w:t>
-      </w:r>
-      <w:r>
-        <w:t xml:space="preserve">dos acidentes </w:t>
-      </w:r>
-      <w:r>
-        <w:t>em um mapa do estado</w:t>
-      </w:r>
-      <w:r>
-        <w:t xml:space="preserve"> de SC</w:t>
-      </w:r>
-      <w:r>
-        <w:t>. Cada ocorrência é representada individualmente e recebe uma classificação visual de acordo com a combinação entre sua gravidade real e a previsão realizada pelo modelo de Regressão Logística.</w:t>
+        <w:t xml:space="preserve">A aplicação apresenta as localizações geográficas dos acidentes em um mapa do estado de SC. Cada ocorrência é representada individualmente e recebe uma classificação visual de acordo com a combinação entre sua gravidade real e a previsão realizada pelo modelo de Regressão Logística.</w:t>
       </w:r>
     </w:p>
     <w:p>
@@ -9113,12 +8644,7 @@
         <w:jc w:val="both"/>
       </w:pPr>
       <w:r>
-        <w:t>A ferramenta também</w:t>
-      </w:r>
-      <w:r>
-        <w:t xml:space="preserve"> permite a exploração individual dos registros. Ao interagir com um ponto do mapa, são apresentadas informações como município, rodovia, </w:t>
-      </w:r>
-      <w:r>
+        <w:t xml:space="preserve">A ferramenta também permite a exploração individual dos registros. Ao interagir com um ponto do mapa, são apresentadas informações como município, rodovia, </w:t>
         <w:lastRenderedPageBreak/>
         <w:t>data, tipo de acidente, causa e probabilidade estimada pelo modelo. Também é possível filtrar visualmente as ocorrências de acordo com as quatro categorias de classificação. Essas funcionalidades permitem observar concentrações de acidentes em determinadas regiões e rodovias, bem como investigar visualmente situações nas quais o modelo apresentou acertos ou erros.</w:t>
       </w:r>
@@ -9140,16 +8666,7 @@
         <w:jc w:val="both"/>
       </w:pPr>
       <w:r>
-        <w:t>Vale ressaltar</w:t>
-      </w:r>
-      <w:r>
-        <w:t xml:space="preserve"> que a aplicação não altera o funcionamento ou os resultados do modelo. Ela utiliza as previsões já produzidas pela Regressão Logística e </w:t>
-      </w:r>
-      <w:r>
-        <w:t>visa unicamente a visualização</w:t>
-      </w:r>
-      <w:r>
-        <w:t>. Assim, mantém-se a limitação apresentada anteriormente no trabalho: o modelo estima a gravidade de acidentes já registrados a partir das condições observadas na ocorrência, não constituindo um sistema de previsão de acidentes em tempo real.</w:t>
+        <w:t xml:space="preserve">Vale ressaltar que a aplicação não altera o funcionamento ou os resultados do modelo. Ela utiliza as previsões já produzidas pela Regressão Logística e visa unicamente a visualização. Assim, mantém-se a limitação apresentada anteriormente no trabalho: o modelo estima a gravidade de acidentes já registrados a partir das condições observadas na ocorrência, não constituindo um sistema de previsão de acidentes em tempo real.</w:t>
       </w:r>
     </w:p>
     <w:p>
@@ -9173,7 +8690,7 @@
           <w:sz w:val="20"/>
           <w:szCs w:val="20"/>
         </w:rPr>
-        <w:t>Tabela 9 – Cronograma de execução</w:t>
+        <w:t>Tabela 10 – Cronograma de execução</w:t>
       </w:r>
     </w:p>
     <w:tbl>
@@ -9645,39 +9162,7 @@
         <w:spacing w:after="240"/>
       </w:pPr>
       <w:r>
-        <w:t xml:space="preserve">GÉRON, </w:t>
-      </w:r>
-      <w:proofErr w:type="spellStart"/>
-      <w:r>
-        <w:t>Aurélien</w:t>
-      </w:r>
-      <w:proofErr w:type="spellEnd"/>
-      <w:r>
-        <w:t xml:space="preserve">. Mãos à obra: aprendizado de máquina com </w:t>
-      </w:r>
-      <w:proofErr w:type="spellStart"/>
-      <w:r>
-        <w:t>Scikit-Learn</w:t>
-      </w:r>
-      <w:proofErr w:type="spellEnd"/>
-      <w:r>
-        <w:t xml:space="preserve">, </w:t>
-      </w:r>
-      <w:proofErr w:type="spellStart"/>
-      <w:r>
-        <w:t>Keras</w:t>
-      </w:r>
-      <w:proofErr w:type="spellEnd"/>
-      <w:r>
-        <w:t xml:space="preserve"> e </w:t>
-      </w:r>
-      <w:proofErr w:type="spellStart"/>
-      <w:r>
-        <w:t>TensorFlow</w:t>
-      </w:r>
-      <w:proofErr w:type="spellEnd"/>
-      <w:r>
-        <w:t>. 2. ed. Rio de Janeiro: Alta Books, 2021.</w:t>
+        <w:t xml:space="preserve">GÉRON, Aurélien. Mãos à obra: aprendizado de máquina com Scikit-Learn, Keras e TensorFlow. 2. ed. Rio de Janeiro: Alta Books, 2021.</w:t>
       </w:r>
     </w:p>
     <w:p>
@@ -9691,28 +9176,8 @@
         <w:spacing w:after="240"/>
       </w:pPr>
       <w:r>
-        <w:t xml:space="preserve">MALAQUIAS, Eveline Oliveira; TOSTA, </w:t>
-      </w:r>
-      <w:proofErr w:type="spellStart"/>
-      <w:r>
-        <w:t>Marielce</w:t>
-      </w:r>
-      <w:proofErr w:type="spellEnd"/>
-      <w:r>
-        <w:t xml:space="preserve"> de Cássia Ribeiro; CHAVES, Gisele de Lorena Diniz; RIBEIRO, </w:t>
-      </w:r>
-      <w:proofErr w:type="spellStart"/>
-      <w:r>
-        <w:t>Glaydston</w:t>
-      </w:r>
-      <w:proofErr w:type="spellEnd"/>
-      <w:r>
-        <w:t xml:space="preserve"> Mattos. Acidentes em rodovias brasileiras: um estudo com técnicas de Machine Learning para classificar a causa das ocorrências. In: CONGRES</w:t>
-      </w:r>
-      <w:r>
+        <w:t xml:space="preserve">MALAQUIAS, Eveline Oliveira; TOSTA, Marielce de Cássia Ribeiro; CHAVES, Gisele de Lorena Diniz; RIBEIRO, Glaydston Mattos. Acidentes em rodovias brasileiras: um estudo com técnicas de Machine Learning para classificar a causa das ocorrências. In: CONGRES</w:t>
         <w:tab/>
-      </w:r>
-      <w:r>
         <w:t>SO DE PESQUISA E ENSINO EM TRANSPORTES (ANPET), 35., 2021. Anais. 2021.</w:t>
       </w:r>
     </w:p>
@@ -9732,45 +9197,10 @@
         <w:rPr>
           <w:lang w:val="en-US"/>
         </w:rPr>
-        <w:t>PEDREGOSA, Fabian et al. Scikit-</w:t>
-      </w:r>
-      <w:proofErr w:type="gramStart"/>
-      <w:r>
-        <w:rPr>
-          <w:lang w:val="en-US"/>
-        </w:rPr>
-        <w:t>learn:</w:t>
-      </w:r>
-      <w:proofErr w:type="gramEnd"/>
-      <w:r>
-        <w:rPr>
-          <w:lang w:val="en-US"/>
-        </w:rPr>
-        <w:t xml:space="preserve"> machine learning in Python. </w:t>
-      </w:r>
-      <w:proofErr w:type="spellStart"/>
-      <w:r>
-        <w:t>Journal</w:t>
-      </w:r>
-      <w:proofErr w:type="spellEnd"/>
-      <w:r>
-        <w:t xml:space="preserve"> </w:t>
-      </w:r>
-      <w:proofErr w:type="spellStart"/>
-      <w:r>
-        <w:t>of</w:t>
-      </w:r>
-      <w:proofErr w:type="spellEnd"/>
-      <w:r>
-        <w:t xml:space="preserve"> Machine Learning </w:t>
-      </w:r>
-      <w:proofErr w:type="spellStart"/>
-      <w:r>
-        <w:t>Research</w:t>
-      </w:r>
-      <w:proofErr w:type="spellEnd"/>
-      <w:r>
-        <w:t>, v. 12, p. 2825-2830, 2011.</w:t>
+        <w:t xml:space="preserve">PEDREGOSA, Fabian et al. Scikit-learn: machine learning in Python. </w:t>
+      </w:r>
+      <w:r>
+        <w:t xml:space="preserve">Journal of Machine Learning Research, v. 12, p. 2825-2830, 2011.</w:t>
       </w:r>
     </w:p>
     <w:p>
@@ -9778,23 +9208,7 @@
         <w:spacing w:after="240"/>
       </w:pPr>
       <w:r>
-        <w:t xml:space="preserve">SOUSA, George Isaac Lopes de; RODRIGUES, Maria Clara de Oliveira; ROSA, Amanda Gadelha Ferreira. Aprendizado de máquina na análise de sinistros de trânsito: um estudo na zona urbana de Teresina - PI. </w:t>
-      </w:r>
-      <w:proofErr w:type="spellStart"/>
-      <w:r>
-        <w:t>Scientia</w:t>
-      </w:r>
-      <w:proofErr w:type="spellEnd"/>
-      <w:r>
-        <w:t xml:space="preserve"> </w:t>
-      </w:r>
-      <w:proofErr w:type="spellStart"/>
-      <w:r>
-        <w:t>Generalis</w:t>
-      </w:r>
-      <w:proofErr w:type="spellEnd"/>
-      <w:r>
-        <w:t>, v. 7, n. 1, p. 1157-1175, 2026.</w:t>
+        <w:t xml:space="preserve">SOUSA, George Isaac Lopes de; RODRIGUES, Maria Clara de Oliveira; ROSA, Amanda Gadelha Ferreira. Aprendizado de máquina na análise de sinistros de trânsito: um estudo na zona urbana de Teresina - PI. Scientia Generalis, v. 7, n. 1, p. 1157-1175, 2026.</w:t>
       </w:r>
     </w:p>
     <w:sectPr>

</xml_diff>